<commit_message>
Add project artifacts and references
</commit_message>
<xml_diff>
--- a/DS360_Project-Phase 1 (11).docx
+++ b/DS360_Project-Phase 1 (11).docx
@@ -80,11 +80,10 @@
                               <w:dataBinding w:prefixMappings="xmlns:ns0='http://purl.org/dc/elements/1.1/' xmlns:ns1='http://schemas.openxmlformats.org/package/2006/metadata/core-properties' " w:xpath="/ns1:coreProperties[1]/ns0:title[1]" w:storeItemID="{6C3C8BC8-F283-45AE-878A-BAB7291924A1}"/>
                               <w:text/>
                             </w:sdtPr>
-                            <w:sdtEndPr/>
                             <w:sdtContent>
                               <w:p>
                                 <w:pPr>
-                                  <w:pStyle w:val="Title"/>
+                                  <w:pStyle w:val="a9"/>
                                   <w:jc w:val="center"/>
                                   <w:rPr>
                                     <w:sz w:val="96"/>
@@ -110,7 +109,7 @@
                           </w:sdt>
                           <w:p>
                             <w:pPr>
-                              <w:pStyle w:val="Subtitle"/>
+                              <w:pStyle w:val="a6"/>
                               <w:ind w:left="709" w:right="720"/>
                               <w:jc w:val="center"/>
                               <w:rPr>
@@ -145,7 +144,6 @@
                                 <w:dataBinding w:prefixMappings="xmlns:ns0='http://purl.org/dc/elements/1.1/' xmlns:ns1='http://schemas.openxmlformats.org/package/2006/metadata/core-properties' " w:xpath="/ns1:coreProperties[1]/ns0:subject[1]" w:storeItemID="{6C3C8BC8-F283-45AE-878A-BAB7291924A1}"/>
                                 <w:text/>
                               </w:sdtPr>
-                              <w:sdtEndPr/>
                               <w:sdtContent>
                                 <w:r>
                                   <w:rPr>
@@ -388,7 +386,6 @@
                               <w:dataBinding w:prefixMappings="xmlns:ns0='http://schemas.microsoft.com/office/2006/coverPageProps'" w:xpath="/ns0:CoverPageProperties[1]/ns0:Abstract[1]" w:storeItemID="{55AF091B-3C7A-41E3-B477-F2FDAA23CFDA}"/>
                               <w:text/>
                             </w:sdtPr>
-                            <w:sdtEndPr/>
                             <w:sdtContent>
                               <w:p>
                                 <w:pPr>
@@ -463,7 +460,7 @@
                 <v:stroke joinstyle="miter"/>
                 <v:path gradientshapeok="t" o:connecttype="rect"/>
               </v:shapetype>
-              <v:shape id="Text Box 14" o:spid="_x0000_s1026" type="#_x0000_t202" alt="Report title" style="position:absolute;margin-left:36.25pt;margin-top:90.25pt;width:540pt;height:164.7pt;z-index:-251641856;visibility:visible;mso-wrap-style:square;mso-width-percent:0;mso-height-percent:0;mso-wrap-distance-left:9pt;mso-wrap-distance-top:0;mso-wrap-distance-right:9pt;mso-wrap-distance-bottom:0;mso-position-horizontal:absolute;mso-position-horizontal-relative:page;mso-position-vertical:absolute;mso-position-vertical-relative:margin;mso-width-percent:0;mso-height-percent:0;mso-width-relative:margin;mso-height-relative:margin;v-text-anchor:bottom" o:gfxdata="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" o:allowoverlap="f" filled="f" stroked="f">
+              <v:shape id="Text Box 14" o:spid="_x0000_s1026" type="#_x0000_t202" alt="Report title" style="position:absolute;margin-left:36.25pt;margin-top:90.25pt;width:540pt;height:164.7pt;z-index:-251641856;visibility:visible;mso-wrap-style:square;mso-width-percent:0;mso-height-percent:0;mso-wrap-distance-left:9pt;mso-wrap-distance-top:0;mso-wrap-distance-right:9pt;mso-wrap-distance-bottom:0;mso-position-horizontal:absolute;mso-position-horizontal-relative:page;mso-position-vertical:absolute;mso-position-vertical-relative:margin;mso-width-percent:0;mso-height-percent:0;mso-width-relative:margin;mso-height-relative:margin;v-text-anchor:bottom" o:gfxdata="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" o:allowoverlap="f" filled="f" stroked="f">
                 <v:textbox inset="0,0,0,0">
                   <w:txbxContent>
                     <w:sdt>
@@ -481,7 +478,6 @@
                         <w:dataBinding w:prefixMappings="xmlns:ns0='http://purl.org/dc/elements/1.1/' xmlns:ns1='http://schemas.openxmlformats.org/package/2006/metadata/core-properties' " w:xpath="/ns1:coreProperties[1]/ns0:title[1]" w:storeItemID="{6C3C8BC8-F283-45AE-878A-BAB7291924A1}"/>
                         <w:text/>
                       </w:sdtPr>
-                      <w:sdtEndPr/>
                       <w:sdtContent>
                         <w:p>
                           <w:pPr>
@@ -546,7 +542,6 @@
                           <w:dataBinding w:prefixMappings="xmlns:ns0='http://purl.org/dc/elements/1.1/' xmlns:ns1='http://schemas.openxmlformats.org/package/2006/metadata/core-properties' " w:xpath="/ns1:coreProperties[1]/ns0:subject[1]" w:storeItemID="{6C3C8BC8-F283-45AE-878A-BAB7291924A1}"/>
                           <w:text/>
                         </w:sdtPr>
-                        <w:sdtEndPr/>
                         <w:sdtContent>
                           <w:r>
                             <w:rPr>
@@ -789,7 +784,6 @@
                         <w:dataBinding w:prefixMappings="xmlns:ns0='http://schemas.microsoft.com/office/2006/coverPageProps'" w:xpath="/ns0:CoverPageProperties[1]/ns0:Abstract[1]" w:storeItemID="{55AF091B-3C7A-41E3-B477-F2FDAA23CFDA}"/>
                         <w:text/>
                       </w:sdtPr>
-                      <w:sdtEndPr/>
                       <w:sdtContent>
                         <w:p>
                           <w:pPr>
@@ -1027,7 +1021,7 @@
           </mc:Choice>
           <mc:Fallback>
             <w:pict>
-              <v:shape w14:anchorId="6466823C" id="Text Box 2" o:spid="_x0000_s1027" type="#_x0000_t202" style="position:absolute;margin-left:40.3pt;margin-top:4.65pt;width:545.45pt;height:87.85pt;z-index:251679744;visibility:visible;mso-wrap-style:square;mso-width-percent:0;mso-height-percent:0;mso-wrap-distance-left:9pt;mso-wrap-distance-top:7.2pt;mso-wrap-distance-right:9pt;mso-wrap-distance-bottom:7.2pt;mso-position-horizontal:absolute;mso-position-horizontal-relative:page;mso-position-vertical:absolute;mso-position-vertical-relative:text;mso-width-percent:0;mso-height-percent:0;mso-width-relative:margin;mso-height-relative:margin;v-text-anchor:top" o:gfxdata="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" filled="f" stroked="f">
+              <v:shape w14:anchorId="6466823C" id="Text Box 2" o:spid="_x0000_s1027" type="#_x0000_t202" style="position:absolute;margin-left:40.3pt;margin-top:4.65pt;width:545.45pt;height:87.85pt;z-index:251679744;visibility:visible;mso-wrap-style:square;mso-width-percent:0;mso-height-percent:0;mso-wrap-distance-left:9pt;mso-wrap-distance-top:7.2pt;mso-wrap-distance-right:9pt;mso-wrap-distance-bottom:7.2pt;mso-position-horizontal:absolute;mso-position-horizontal-relative:page;mso-position-vertical:absolute;mso-position-vertical-relative:text;mso-width-percent:0;mso-height-percent:0;mso-width-relative:margin;mso-height-relative:margin;v-text-anchor:top" o:gfxdata="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" filled="f" stroked="f">
                 <v:textbox>
                   <w:txbxContent>
                     <w:p>
@@ -1164,7 +1158,6 @@
           <w:docPartUnique/>
         </w:docPartObj>
       </w:sdtPr>
-      <w:sdtEndPr/>
       <w:sdtContent>
         <w:p>
           <w:pPr>
@@ -1319,7 +1312,7 @@
                               <w:txbxContent>
                                 <w:p>
                                   <w:pPr>
-                                    <w:pStyle w:val="ListParagraph"/>
+                                    <w:pStyle w:val="af5"/>
                                     <w:numPr>
                                       <w:ilvl w:val="0"/>
                                       <w:numId w:val="6"/>
@@ -1388,7 +1381,7 @@
                                 </w:p>
                                 <w:p>
                                   <w:pPr>
-                                    <w:pStyle w:val="ListParagraph"/>
+                                    <w:pStyle w:val="af5"/>
                                     <w:numPr>
                                       <w:ilvl w:val="0"/>
                                       <w:numId w:val="6"/>
@@ -1409,7 +1402,7 @@
                                 </w:p>
                                 <w:p>
                                   <w:pPr>
-                                    <w:pStyle w:val="ListParagraph"/>
+                                    <w:pStyle w:val="af5"/>
                                     <w:numPr>
                                       <w:ilvl w:val="0"/>
                                       <w:numId w:val="6"/>
@@ -1533,7 +1526,7 @@
                                 </w:p>
                                 <w:p>
                                   <w:pPr>
-                                    <w:pStyle w:val="ListParagraph"/>
+                                    <w:pStyle w:val="af5"/>
                                     <w:numPr>
                                       <w:ilvl w:val="0"/>
                                       <w:numId w:val="6"/>
@@ -1555,7 +1548,7 @@
                                 </w:p>
                                 <w:p>
                                   <w:pPr>
-                                    <w:pStyle w:val="ListParagraph"/>
+                                    <w:pStyle w:val="af5"/>
                                     <w:numPr>
                                       <w:ilvl w:val="0"/>
                                       <w:numId w:val="6"/>
@@ -1583,7 +1576,7 @@
                                 </w:p>
                                 <w:p>
                                   <w:pPr>
-                                    <w:pStyle w:val="ListParagraph"/>
+                                    <w:pStyle w:val="af5"/>
                                     <w:numPr>
                                       <w:ilvl w:val="0"/>
                                       <w:numId w:val="6"/>
@@ -1605,7 +1598,7 @@
                                 </w:p>
                                 <w:p>
                                   <w:pPr>
-                                    <w:pStyle w:val="ListParagraph"/>
+                                    <w:pStyle w:val="af5"/>
                                     <w:numPr>
                                       <w:ilvl w:val="0"/>
                                       <w:numId w:val="6"/>
@@ -1652,7 +1645,7 @@
                                 </w:p>
                                 <w:p>
                                   <w:pPr>
-                                    <w:pStyle w:val="ListParagraph"/>
+                                    <w:pStyle w:val="af5"/>
                                     <w:numPr>
                                       <w:ilvl w:val="0"/>
                                       <w:numId w:val="6"/>
@@ -1674,7 +1667,7 @@
                                 </w:p>
                                 <w:p>
                                   <w:pPr>
-                                    <w:pStyle w:val="ListParagraph"/>
+                                    <w:pStyle w:val="af5"/>
                                     <w:numPr>
                                       <w:ilvl w:val="0"/>
                                       <w:numId w:val="6"/>
@@ -1714,7 +1707,7 @@
                                 </w:p>
                                 <w:p>
                                   <w:pPr>
-                                    <w:pStyle w:val="ListParagraph"/>
+                                    <w:pStyle w:val="af5"/>
                                     <w:numPr>
                                       <w:ilvl w:val="0"/>
                                       <w:numId w:val="6"/>
@@ -1776,7 +1769,7 @@
               </mc:Choice>
               <mc:Fallback>
                 <w:pict>
-                  <v:group w14:anchorId="31857F9A" id="Group 198" o:spid="_x0000_s1028" style="position:absolute;left:0;text-align:left;margin-left:-102pt;margin-top:353.05pt;width:518.25pt;height:318.6pt;z-index:251677696;mso-wrap-distance-left:14.4pt;mso-wrap-distance-top:3.6pt;mso-wrap-distance-right:14.4pt;mso-wrap-distance-bottom:3.6pt;mso-position-horizontal-relative:margin;mso-position-vertical-relative:margin;mso-width-relative:margin;mso-height-relative:margin" coordorigin=",228" coordsize="35784,22576" o:gfxdata="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">
+                  <v:group w14:anchorId="31857F9A" id="Group 198" o:spid="_x0000_s1028" style="position:absolute;left:0;text-align:left;margin-left:-102pt;margin-top:353.05pt;width:518.25pt;height:318.6pt;z-index:251677696;mso-wrap-distance-left:14.4pt;mso-wrap-distance-top:3.6pt;mso-wrap-distance-right:14.4pt;mso-wrap-distance-bottom:3.6pt;mso-position-horizontal-relative:margin;mso-position-vertical-relative:margin;mso-width-relative:margin;mso-height-relative:margin" coordorigin=",228" coordsize="35784,22576" o:gfxdata="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">
                     <v:rect id="Rectangle 199" o:spid="_x0000_s1029" style="position:absolute;top:228;width:35674;height:2448;visibility:visible;mso-wrap-style:square;v-text-anchor:middle" o:gfxdata="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" fillcolor="#ef4623 [3204]" stroked="f" strokeweight="2pt">
                       <v:textbox>
                         <w:txbxContent>
@@ -2324,7 +2317,6 @@
                                     <w:dataBinding w:prefixMappings="xmlns:ns0='http://schemas.openxmlformats.org/officeDocument/2006/extended-properties' " w:xpath="/ns0:Properties[1]/ns0:Company[1]" w:storeItemID="{6668398D-A668-4E3E-A5EB-62B293D839F1}"/>
                                     <w:text/>
                                   </w:sdtPr>
-                                  <w:sdtEndPr/>
                                   <w:sdtContent>
                                     <w:r>
                                       <w:t>Student Details:                                            CRN:</w:t>
@@ -2334,7 +2326,7 @@
                               </w:p>
                               <w:tbl>
                                 <w:tblPr>
-                                  <w:tblW w:w="4993" w:type="pct"/>
+                                  <w:tblW w:w="4986" w:type="pct"/>
                                   <w:jc w:val="right"/>
                                   <w:tblBorders>
                                     <w:top w:val="single" w:sz="8" w:space="0" w:color="000000" w:themeColor="text1"/>
@@ -2346,9 +2338,9 @@
                                   <w:tblLook w:val="04A0" w:firstRow="1" w:lastRow="0" w:firstColumn="1" w:lastColumn="0" w:noHBand="0" w:noVBand="1"/>
                                 </w:tblPr>
                                 <w:tblGrid>
-                                  <w:gridCol w:w="3870"/>
-                                  <w:gridCol w:w="3323"/>
-                                  <w:gridCol w:w="3597"/>
+                                  <w:gridCol w:w="4254"/>
+                                  <w:gridCol w:w="2931"/>
+                                  <w:gridCol w:w="3590"/>
                                 </w:tblGrid>
                                 <w:tr>
                                   <w:trPr>
@@ -2357,13 +2349,13 @@
                                   </w:trPr>
                                   <w:tc>
                                     <w:tcPr>
-                                      <w:tcW w:w="1793" w:type="pct"/>
+                                      <w:tcW w:w="1974" w:type="pct"/>
                                     </w:tcPr>
                                     <w:p/>
                                   </w:tc>
                                   <w:tc>
                                     <w:tcPr>
-                                      <w:tcW w:w="1540" w:type="pct"/>
+                                      <w:tcW w:w="1360" w:type="pct"/>
                                     </w:tcPr>
                                     <w:p/>
                                   </w:tc>
@@ -2380,14 +2372,14 @@
                                   </w:trPr>
                                   <w:tc>
                                     <w:tcPr>
-                                      <w:tcW w:w="1793" w:type="pct"/>
+                                      <w:tcW w:w="1974" w:type="pct"/>
                                       <w:tcMar>
                                         <w:bottom w:w="144" w:type="dxa"/>
                                       </w:tcMar>
                                     </w:tcPr>
                                     <w:p>
                                       <w:pPr>
-                                        <w:pStyle w:val="Footer"/>
+                                        <w:pStyle w:val="a5"/>
                                         <w:rPr>
                                           <w:b/>
                                           <w:bCs/>
@@ -2427,7 +2419,7 @@
                                     </w:p>
                                     <w:p>
                                       <w:pPr>
-                                        <w:pStyle w:val="Footer"/>
+                                        <w:pStyle w:val="a5"/>
                                         <w:rPr>
                                           <w:b/>
                                           <w:bCs/>
@@ -2456,7 +2448,7 @@
                                     </w:p>
                                     <w:p>
                                       <w:pPr>
-                                        <w:pStyle w:val="Footer"/>
+                                        <w:pStyle w:val="a5"/>
                                         <w:rPr>
                                           <w:b/>
                                           <w:bCs/>
@@ -2482,18 +2474,27 @@
                                         </w:rPr>
                                         <w:t xml:space="preserve"> </w:t>
                                       </w:r>
+                                      <w:r>
+                                        <w:rPr>
+                                          <w:b/>
+                                          <w:bCs/>
+                                          <w:sz w:val="28"/>
+                                          <w:szCs w:val="28"/>
+                                        </w:rPr>
+                                        <w:t>Leen Hisham Madkhal</w:t>
+                                      </w:r>
                                     </w:p>
                                   </w:tc>
                                   <w:tc>
                                     <w:tcPr>
-                                      <w:tcW w:w="1540" w:type="pct"/>
+                                      <w:tcW w:w="1360" w:type="pct"/>
                                       <w:tcMar>
                                         <w:bottom w:w="144" w:type="dxa"/>
                                       </w:tcMar>
                                     </w:tcPr>
                                     <w:p>
                                       <w:pPr>
-                                        <w:pStyle w:val="Footer"/>
+                                        <w:pStyle w:val="a5"/>
                                         <w:ind w:left="0"/>
                                         <w:rPr>
                                           <w:b/>
@@ -2511,7 +2512,7 @@
                                     </w:tcPr>
                                     <w:p>
                                       <w:pPr>
-                                        <w:pStyle w:val="Footer"/>
+                                        <w:pStyle w:val="a5"/>
                                         <w:rPr>
                                           <w:b/>
                                           <w:bCs/>
@@ -2540,7 +2541,7 @@
                                     </w:p>
                                     <w:p>
                                       <w:pPr>
-                                        <w:pStyle w:val="Footer"/>
+                                        <w:pStyle w:val="a5"/>
                                         <w:rPr>
                                           <w:b/>
                                           <w:bCs/>
@@ -2572,7 +2573,7 @@
                                     </w:p>
                                     <w:p>
                                       <w:pPr>
-                                        <w:pStyle w:val="Footer"/>
+                                        <w:pStyle w:val="a5"/>
                                         <w:rPr>
                                           <w:b/>
                                           <w:bCs/>
@@ -2587,6 +2588,31 @@
                                         </w:rPr>
                                         <w:t>ID:</w:t>
                                       </w:r>
+                                      <w:r>
+                                        <w:rPr>
+                                          <w:b/>
+                                          <w:bCs/>
+                                        </w:rPr>
+                                        <w:t xml:space="preserve"> </w:t>
+                                      </w:r>
+                                      <w:r>
+                                        <w:rPr>
+                                          <w:b/>
+                                          <w:bCs/>
+                                          <w:sz w:val="28"/>
+                                          <w:szCs w:val="28"/>
+                                        </w:rPr>
+                                        <w:t>S2</w:t>
+                                      </w:r>
+                                      <w:r>
+                                        <w:rPr>
+                                          <w:b/>
+                                          <w:bCs/>
+                                          <w:sz w:val="28"/>
+                                          <w:szCs w:val="28"/>
+                                        </w:rPr>
+                                        <w:t>30039003</w:t>
+                                      </w:r>
                                     </w:p>
                                   </w:tc>
                                 </w:tr>
@@ -2597,23 +2623,23 @@
                                   </w:trPr>
                                   <w:tc>
                                     <w:tcPr>
-                                      <w:tcW w:w="1793" w:type="pct"/>
+                                      <w:tcW w:w="1974" w:type="pct"/>
                                       <w:shd w:val="clear" w:color="auto" w:fill="000000" w:themeFill="text1"/>
                                     </w:tcPr>
                                     <w:p>
                                       <w:pPr>
-                                        <w:pStyle w:val="Footer"/>
+                                        <w:pStyle w:val="a5"/>
                                       </w:pPr>
                                     </w:p>
                                   </w:tc>
                                   <w:tc>
                                     <w:tcPr>
-                                      <w:tcW w:w="1540" w:type="pct"/>
+                                      <w:tcW w:w="1360" w:type="pct"/>
                                       <w:shd w:val="clear" w:color="auto" w:fill="000000" w:themeFill="text1"/>
                                     </w:tcPr>
                                     <w:p>
                                       <w:pPr>
-                                        <w:pStyle w:val="Footer"/>
+                                        <w:pStyle w:val="a5"/>
                                       </w:pPr>
                                     </w:p>
                                   </w:tc>
@@ -2624,7 +2650,7 @@
                                     </w:tcPr>
                                     <w:p>
                                       <w:pPr>
-                                        <w:pStyle w:val="Footer"/>
+                                        <w:pStyle w:val="a5"/>
                                       </w:pPr>
                                     </w:p>
                                   </w:tc>
@@ -2632,7 +2658,7 @@
                               </w:tbl>
                               <w:p>
                                 <w:pPr>
-                                  <w:pStyle w:val="NoSpacing"/>
+                                  <w:pStyle w:val="ad"/>
                                 </w:pPr>
                               </w:p>
                             </w:txbxContent>
@@ -2657,11 +2683,7 @@
               </mc:Choice>
               <mc:Fallback>
                 <w:pict>
-                  <v:shapetype w14:anchorId="7CBAAF0B" id="_x0000_t202" coordsize="21600,21600" o:spt="202" path="m,l,21600r21600,l21600,xe">
-                    <v:stroke joinstyle="miter"/>
-                    <v:path gradientshapeok="t" o:connecttype="rect"/>
-                  </v:shapetype>
-                  <v:shape id="Text Box 15" o:spid="_x0000_s1031" type="#_x0000_t202" alt="contact info" style="position:absolute;left:0;text-align:left;margin-left:488.8pt;margin-top:253.85pt;width:540pt;height:92.7pt;z-index:251675648;visibility:visible;mso-wrap-style:square;mso-width-percent:1282;mso-height-percent:0;mso-wrap-distance-left:9pt;mso-wrap-distance-top:0;mso-wrap-distance-right:9pt;mso-wrap-distance-bottom:0;mso-position-horizontal:right;mso-position-horizontal-relative:margin;mso-position-vertical:absolute;mso-position-vertical-relative:margin;mso-width-percent:1282;mso-height-percent:0;mso-width-relative:margin;mso-height-relative:margin;v-text-anchor:bottom" o:gfxdata="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" o:allowoverlap="f" filled="f" stroked="f" strokeweight=".5pt">
+                  <v:shape w14:anchorId="7CBAAF0B" id="Text Box 15" o:spid="_x0000_s1031" type="#_x0000_t202" alt="contact info" style="position:absolute;left:0;text-align:left;margin-left:488.8pt;margin-top:253.85pt;width:540pt;height:92.7pt;z-index:251675648;visibility:visible;mso-wrap-style:square;mso-width-percent:1282;mso-height-percent:0;mso-wrap-distance-left:9pt;mso-wrap-distance-top:0;mso-wrap-distance-right:9pt;mso-wrap-distance-bottom:0;mso-position-horizontal:right;mso-position-horizontal-relative:margin;mso-position-vertical:absolute;mso-position-vertical-relative:margin;mso-width-percent:1282;mso-height-percent:0;mso-width-relative:margin;mso-height-relative:margin;v-text-anchor:bottom" o:gfxdata="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" o:allowoverlap="f" filled="f" stroked="f" strokeweight=".5pt">
                     <v:textbox inset="0,0,0,0">
                       <w:txbxContent>
                         <w:p>
@@ -2676,7 +2698,6 @@
                               <w:dataBinding w:prefixMappings="xmlns:ns0='http://schemas.openxmlformats.org/officeDocument/2006/extended-properties' " w:xpath="/ns0:Properties[1]/ns0:Company[1]" w:storeItemID="{6668398D-A668-4E3E-A5EB-62B293D839F1}"/>
                               <w:text/>
                             </w:sdtPr>
-                            <w:sdtEndPr/>
                             <w:sdtContent>
                               <w:r>
                                 <w:t>Student Details:                                            CRN:</w:t>
@@ -2686,7 +2707,7 @@
                         </w:p>
                         <w:tbl>
                           <w:tblPr>
-                            <w:tblW w:w="4993" w:type="pct"/>
+                            <w:tblW w:w="4986" w:type="pct"/>
                             <w:jc w:val="right"/>
                             <w:tblBorders>
                               <w:top w:val="single" w:sz="8" w:space="0" w:color="000000" w:themeColor="text1"/>
@@ -2698,9 +2719,9 @@
                             <w:tblLook w:val="04A0" w:firstRow="1" w:lastRow="0" w:firstColumn="1" w:lastColumn="0" w:noHBand="0" w:noVBand="1"/>
                           </w:tblPr>
                           <w:tblGrid>
-                            <w:gridCol w:w="3870"/>
-                            <w:gridCol w:w="3323"/>
-                            <w:gridCol w:w="3597"/>
+                            <w:gridCol w:w="4254"/>
+                            <w:gridCol w:w="2931"/>
+                            <w:gridCol w:w="3590"/>
                           </w:tblGrid>
                           <w:tr>
                             <w:trPr>
@@ -2709,13 +2730,13 @@
                             </w:trPr>
                             <w:tc>
                               <w:tcPr>
-                                <w:tcW w:w="1793" w:type="pct"/>
+                                <w:tcW w:w="1974" w:type="pct"/>
                               </w:tcPr>
                               <w:p/>
                             </w:tc>
                             <w:tc>
                               <w:tcPr>
-                                <w:tcW w:w="1540" w:type="pct"/>
+                                <w:tcW w:w="1360" w:type="pct"/>
                               </w:tcPr>
                               <w:p/>
                             </w:tc>
@@ -2732,14 +2753,14 @@
                             </w:trPr>
                             <w:tc>
                               <w:tcPr>
-                                <w:tcW w:w="1793" w:type="pct"/>
+                                <w:tcW w:w="1974" w:type="pct"/>
                                 <w:tcMar>
                                   <w:bottom w:w="144" w:type="dxa"/>
                                 </w:tcMar>
                               </w:tcPr>
                               <w:p>
                                 <w:pPr>
-                                  <w:pStyle w:val="Footer"/>
+                                  <w:pStyle w:val="a5"/>
                                   <w:rPr>
                                     <w:b/>
                                     <w:bCs/>
@@ -2779,7 +2800,7 @@
                               </w:p>
                               <w:p>
                                 <w:pPr>
-                                  <w:pStyle w:val="Footer"/>
+                                  <w:pStyle w:val="a5"/>
                                   <w:rPr>
                                     <w:b/>
                                     <w:bCs/>
@@ -2808,7 +2829,7 @@
                               </w:p>
                               <w:p>
                                 <w:pPr>
-                                  <w:pStyle w:val="Footer"/>
+                                  <w:pStyle w:val="a5"/>
                                   <w:rPr>
                                     <w:b/>
                                     <w:bCs/>
@@ -2834,18 +2855,27 @@
                                   </w:rPr>
                                   <w:t xml:space="preserve"> </w:t>
                                 </w:r>
+                                <w:r>
+                                  <w:rPr>
+                                    <w:b/>
+                                    <w:bCs/>
+                                    <w:sz w:val="28"/>
+                                    <w:szCs w:val="28"/>
+                                  </w:rPr>
+                                  <w:t>Leen Hisham Madkhal</w:t>
+                                </w:r>
                               </w:p>
                             </w:tc>
                             <w:tc>
                               <w:tcPr>
-                                <w:tcW w:w="1540" w:type="pct"/>
+                                <w:tcW w:w="1360" w:type="pct"/>
                                 <w:tcMar>
                                   <w:bottom w:w="144" w:type="dxa"/>
                                 </w:tcMar>
                               </w:tcPr>
                               <w:p>
                                 <w:pPr>
-                                  <w:pStyle w:val="Footer"/>
+                                  <w:pStyle w:val="a5"/>
                                   <w:ind w:left="0"/>
                                   <w:rPr>
                                     <w:b/>
@@ -2863,7 +2893,7 @@
                               </w:tcPr>
                               <w:p>
                                 <w:pPr>
-                                  <w:pStyle w:val="Footer"/>
+                                  <w:pStyle w:val="a5"/>
                                   <w:rPr>
                                     <w:b/>
                                     <w:bCs/>
@@ -2892,7 +2922,7 @@
                               </w:p>
                               <w:p>
                                 <w:pPr>
-                                  <w:pStyle w:val="Footer"/>
+                                  <w:pStyle w:val="a5"/>
                                   <w:rPr>
                                     <w:b/>
                                     <w:bCs/>
@@ -2924,7 +2954,7 @@
                               </w:p>
                               <w:p>
                                 <w:pPr>
-                                  <w:pStyle w:val="Footer"/>
+                                  <w:pStyle w:val="a5"/>
                                   <w:rPr>
                                     <w:b/>
                                     <w:bCs/>
@@ -2939,6 +2969,31 @@
                                   </w:rPr>
                                   <w:t>ID:</w:t>
                                 </w:r>
+                                <w:r>
+                                  <w:rPr>
+                                    <w:b/>
+                                    <w:bCs/>
+                                  </w:rPr>
+                                  <w:t xml:space="preserve"> </w:t>
+                                </w:r>
+                                <w:r>
+                                  <w:rPr>
+                                    <w:b/>
+                                    <w:bCs/>
+                                    <w:sz w:val="28"/>
+                                    <w:szCs w:val="28"/>
+                                  </w:rPr>
+                                  <w:t>S2</w:t>
+                                </w:r>
+                                <w:r>
+                                  <w:rPr>
+                                    <w:b/>
+                                    <w:bCs/>
+                                    <w:sz w:val="28"/>
+                                    <w:szCs w:val="28"/>
+                                  </w:rPr>
+                                  <w:t>30039003</w:t>
+                                </w:r>
                               </w:p>
                             </w:tc>
                           </w:tr>
@@ -2949,23 +3004,23 @@
                             </w:trPr>
                             <w:tc>
                               <w:tcPr>
-                                <w:tcW w:w="1793" w:type="pct"/>
+                                <w:tcW w:w="1974" w:type="pct"/>
                                 <w:shd w:val="clear" w:color="auto" w:fill="000000" w:themeFill="text1"/>
                               </w:tcPr>
                               <w:p>
                                 <w:pPr>
-                                  <w:pStyle w:val="Footer"/>
+                                  <w:pStyle w:val="a5"/>
                                 </w:pPr>
                               </w:p>
                             </w:tc>
                             <w:tc>
                               <w:tcPr>
-                                <w:tcW w:w="1540" w:type="pct"/>
+                                <w:tcW w:w="1360" w:type="pct"/>
                                 <w:shd w:val="clear" w:color="auto" w:fill="000000" w:themeFill="text1"/>
                               </w:tcPr>
                               <w:p>
                                 <w:pPr>
-                                  <w:pStyle w:val="Footer"/>
+                                  <w:pStyle w:val="a5"/>
                                 </w:pPr>
                               </w:p>
                             </w:tc>
@@ -2976,7 +3031,7 @@
                               </w:tcPr>
                               <w:p>
                                 <w:pPr>
-                                  <w:pStyle w:val="Footer"/>
+                                  <w:pStyle w:val="a5"/>
                                 </w:pPr>
                               </w:p>
                             </w:tc>
@@ -2984,7 +3039,7 @@
                         </w:tbl>
                         <w:p>
                           <w:pPr>
-                            <w:pStyle w:val="NoSpacing"/>
+                            <w:pStyle w:val="ad"/>
                           </w:pPr>
                         </w:p>
                       </w:txbxContent>
@@ -3026,7 +3081,7 @@
     </w:p>
     <w:p>
       <w:pPr>
-        <w:pStyle w:val="Heading1"/>
+        <w:pStyle w:val="1"/>
         <w:spacing w:line="276" w:lineRule="auto"/>
         <w:rPr>
           <w:rFonts w:ascii="Times New Roman" w:hAnsi="Times New Roman" w:cs="Times New Roman"/>
@@ -3143,7 +3198,7 @@
     </w:p>
     <w:p>
       <w:pPr>
-        <w:pStyle w:val="ListParagraph"/>
+        <w:pStyle w:val="af5"/>
         <w:numPr>
           <w:ilvl w:val="0"/>
           <w:numId w:val="40"/>
@@ -3187,7 +3242,7 @@
     </w:p>
     <w:p>
       <w:pPr>
-        <w:pStyle w:val="ListParagraph"/>
+        <w:pStyle w:val="af5"/>
         <w:numPr>
           <w:ilvl w:val="0"/>
           <w:numId w:val="40"/>
@@ -3293,7 +3348,7 @@
     </w:p>
     <w:p>
       <w:pPr>
-        <w:pStyle w:val="ListParagraph"/>
+        <w:pStyle w:val="af5"/>
         <w:numPr>
           <w:ilvl w:val="0"/>
           <w:numId w:val="41"/>
@@ -3316,7 +3371,7 @@
     </w:p>
     <w:p>
       <w:pPr>
-        <w:pStyle w:val="ListParagraph"/>
+        <w:pStyle w:val="af5"/>
         <w:numPr>
           <w:ilvl w:val="1"/>
           <w:numId w:val="41"/>
@@ -3363,7 +3418,7 @@
     </w:p>
     <w:p>
       <w:pPr>
-        <w:pStyle w:val="ListParagraph"/>
+        <w:pStyle w:val="af5"/>
         <w:numPr>
           <w:ilvl w:val="1"/>
           <w:numId w:val="41"/>
@@ -3402,7 +3457,7 @@
     </w:p>
     <w:p>
       <w:pPr>
-        <w:pStyle w:val="ListParagraph"/>
+        <w:pStyle w:val="af5"/>
         <w:numPr>
           <w:ilvl w:val="0"/>
           <w:numId w:val="41"/>
@@ -3441,7 +3496,7 @@
     </w:p>
     <w:p>
       <w:pPr>
-        <w:pStyle w:val="ListParagraph"/>
+        <w:pStyle w:val="af5"/>
         <w:numPr>
           <w:ilvl w:val="0"/>
           <w:numId w:val="41"/>
@@ -3465,7 +3520,7 @@
     </w:p>
     <w:p>
       <w:pPr>
-        <w:pStyle w:val="Heading1"/>
+        <w:pStyle w:val="1"/>
         <w:rPr>
           <w:rFonts w:ascii="Times New Roman" w:hAnsi="Times New Roman" w:cs="Times New Roman"/>
           <w:sz w:val="38"/>
@@ -3541,11 +3596,11 @@
                         <w:txbxContent>
                           <w:p>
                             <w:pPr>
-                              <w:pStyle w:val="Quote"/>
+                              <w:pStyle w:val="af"/>
                             </w:pPr>
                             <w:r>
                               <w:rPr>
-                                <w:rStyle w:val="QuoteChar"/>
+                                <w:rStyle w:val="Char5"/>
                                 <w:i/>
                                 <w:iCs/>
                               </w:rPr>
@@ -3611,7 +3666,7 @@
           </mc:Choice>
           <mc:Fallback>
             <w:pict>
-              <v:shape w14:anchorId="6021EF1F" id="Text Box 5" o:spid="_x0000_s1032" type="#_x0000_t202" alt="Sidebar" style="position:absolute;margin-left:36.2pt;margin-top:-14.75pt;width:104.75pt;height:674.6pt;z-index:251683840;visibility:visible;mso-wrap-style:square;mso-width-percent:250;mso-height-percent:0;mso-wrap-distance-left:14.4pt;mso-wrap-distance-top:0;mso-wrap-distance-right:14.4pt;mso-wrap-distance-bottom:3in;mso-position-horizontal:absolute;mso-position-horizontal-relative:page;mso-position-vertical:absolute;mso-position-vertical-relative:margin;mso-width-percent:250;mso-height-percent:0;mso-width-relative:margin;mso-height-relative:margin;v-text-anchor:top" o:gfxdata="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" filled="f" stroked="f" strokeweight=".5pt">
+              <v:shape w14:anchorId="6021EF1F" id="Text Box 5" o:spid="_x0000_s1032" type="#_x0000_t202" alt="Sidebar" style="position:absolute;margin-left:36.2pt;margin-top:-14.75pt;width:104.75pt;height:674.6pt;z-index:251683840;visibility:visible;mso-wrap-style:square;mso-width-percent:250;mso-height-percent:0;mso-wrap-distance-left:14.4pt;mso-wrap-distance-top:0;mso-wrap-distance-right:14.4pt;mso-wrap-distance-bottom:3in;mso-position-horizontal:absolute;mso-position-horizontal-relative:page;mso-position-vertical:absolute;mso-position-vertical-relative:margin;mso-width-percent:250;mso-height-percent:0;mso-width-relative:margin;mso-height-relative:margin;v-text-anchor:top" o:gfxdata="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" filled="f" stroked="f" strokeweight=".5pt">
                 <v:textbox inset="3.6pt,0,3.6pt,0">
                   <w:txbxContent>
                     <w:p>
@@ -3780,8 +3835,7 @@
           </mc:Choice>
           <mc:Fallback>
             <w:pict>
-              <v:shape w14:anchorId="1CDBE634" id="_x0000_s1033" type="#_x0000_t202" alt="Sidebar" style="position:absolute;margin-left:0;margin-top:0;width:105.3pt;height:598.45pt;z-index:251681792;visibility:visible;mso-wrap-style:square;mso-width-percent:250;mso-height-percent:950;mso-left-percent:59;mso-wrap-distance-left:14.4pt;mso-wrap-distance-top:0;mso-wrap-distance-right:14.4pt;mso-wrap-distance-bottom:3in;mso-position-horizontal-relative:page;mso-position-vertical:top;mso-position-vertical-relative:margin;mso-width-percent:250;mso-height-percent:950;mso-left-percent:59;mso-width-relative:margin;mso-height-relative:margin;v-text-anchor:top" o:gfxdata="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" filled="f" stroked="f" strokeweight=".5pt">
-                <v:path arrowok="t"/>
+              <v:shape w14:anchorId="1CDBE634" id="_x0000_s1033" type="#_x0000_t202" alt="Sidebar" style="position:absolute;margin-left:0;margin-top:0;width:105.3pt;height:598.45pt;z-index:251681792;visibility:visible;mso-wrap-style:square;mso-width-percent:250;mso-height-percent:950;mso-left-percent:59;mso-wrap-distance-left:14.4pt;mso-wrap-distance-top:0;mso-wrap-distance-right:14.4pt;mso-wrap-distance-bottom:3in;mso-position-horizontal-relative:page;mso-position-vertical:top;mso-position-vertical-relative:margin;mso-width-percent:250;mso-height-percent:950;mso-left-percent:59;mso-width-relative:margin;mso-height-relative:margin;v-text-anchor:top" o:gfxdata="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" filled="f" stroked="f" strokeweight=".5pt">
                 <v:textbox inset="3.6pt,0,3.6pt,0">
                   <w:txbxContent>
                     <w:p>
@@ -3846,7 +3900,47 @@
           <w:sz w:val="24"/>
           <w:szCs w:val="24"/>
         </w:rPr>
-        <w:t xml:space="preserve">A university operates two campuses: a Main Campus and a Branch Campus. Each campus network is treated as a separate WAN site. Your task is to design and configure, in Cisco Packet Tracer, a network that successfully transmits data packets from a device in any LAN of WAN 1 (Main Campus) to a device in any LAN of WAN 2 (Branch Campus). Each WAN contains 2 LANs, and each LAN has 3 end devices. </w:t>
+        <w:t xml:space="preserve">A university operates two campuses: a Main Campus and a Branch Campus. Each campus network is treated as a separate WAN site. Your task is to design and configure, in Cisco Packet Tracer, a network that successfully transmits data packets from a device in any LAN </w:t>
+      </w:r>
+      <w:proofErr w:type="spellStart"/>
+      <w:r>
+        <w:rPr>
+          <w:rFonts w:ascii="Times New Roman" w:eastAsia="Times New Roman" w:hAnsi="Times New Roman" w:cs="Times New Roman"/>
+          <w:color w:val="auto"/>
+          <w:sz w:val="24"/>
+          <w:szCs w:val="24"/>
+        </w:rPr>
+        <w:t>of</w:t>
+      </w:r>
+      <w:proofErr w:type="spellEnd"/>
+      <w:r>
+        <w:rPr>
+          <w:rFonts w:ascii="Times New Roman" w:eastAsia="Times New Roman" w:hAnsi="Times New Roman" w:cs="Times New Roman"/>
+          <w:color w:val="auto"/>
+          <w:sz w:val="24"/>
+          <w:szCs w:val="24"/>
+        </w:rPr>
+        <w:t xml:space="preserve"> WAN 1 (Main Campus) to a device in any LAN </w:t>
+      </w:r>
+      <w:proofErr w:type="spellStart"/>
+      <w:r>
+        <w:rPr>
+          <w:rFonts w:ascii="Times New Roman" w:eastAsia="Times New Roman" w:hAnsi="Times New Roman" w:cs="Times New Roman"/>
+          <w:color w:val="auto"/>
+          <w:sz w:val="24"/>
+          <w:szCs w:val="24"/>
+        </w:rPr>
+        <w:t>of</w:t>
+      </w:r>
+      <w:proofErr w:type="spellEnd"/>
+      <w:r>
+        <w:rPr>
+          <w:rFonts w:ascii="Times New Roman" w:eastAsia="Times New Roman" w:hAnsi="Times New Roman" w:cs="Times New Roman"/>
+          <w:color w:val="auto"/>
+          <w:sz w:val="24"/>
+          <w:szCs w:val="24"/>
+        </w:rPr>
+        <w:t xml:space="preserve"> WAN 2 (Branch Campus). Each WAN contains 2 LANs, and each LAN has 3 end devices. </w:t>
       </w:r>
     </w:p>
     <w:p>
@@ -3992,7 +4086,27 @@
           <w:sz w:val="24"/>
           <w:szCs w:val="24"/>
         </w:rPr>
-        <w:t>Assign private IP addresses to the devices in each LAN (e.g., use 172.16.10.0/24 for LAN 1 and 172.16.20.0/24 for LAN 2).</w:t>
+        <w:t>Assign private IP addresses to the devices in each LAN (e.g., use 172.16.</w:t>
+      </w:r>
+      <w:proofErr w:type="gramStart"/>
+      <w:r>
+        <w:rPr>
+          <w:rFonts w:ascii="Times New Roman" w:eastAsia="Times New Roman" w:hAnsi="Times New Roman" w:cs="Times New Roman"/>
+          <w:color w:val="auto"/>
+          <w:sz w:val="24"/>
+          <w:szCs w:val="24"/>
+        </w:rPr>
+        <w:t>10.0</w:t>
+      </w:r>
+      <w:proofErr w:type="gramEnd"/>
+      <w:r>
+        <w:rPr>
+          <w:rFonts w:ascii="Times New Roman" w:eastAsia="Times New Roman" w:hAnsi="Times New Roman" w:cs="Times New Roman"/>
+          <w:color w:val="auto"/>
+          <w:sz w:val="24"/>
+          <w:szCs w:val="24"/>
+        </w:rPr>
+        <w:t>/24 for LAN 1 and 172.16.20.0/24 for LAN 2).</w:t>
       </w:r>
     </w:p>
     <w:p>
@@ -4857,7 +4971,7 @@
     </w:p>
     <w:p>
       <w:pPr>
-        <w:pStyle w:val="Heading1"/>
+        <w:pStyle w:val="1"/>
         <w:spacing w:before="240" w:after="160"/>
       </w:pPr>
       <w:r>
@@ -4993,7 +5107,7 @@
                   <v:h position="#0,topLeft" switch="" xrange="0,10800"/>
                 </v:handles>
               </v:shapetype>
-              <v:shape id="Double Bracket 1" o:spid="_x0000_s1034" type="#_x0000_t185" style="position:absolute;margin-left:346.2pt;margin-top:109.85pt;width:68.85pt;height:24.15pt;z-index:251685888;visibility:visible;mso-wrap-style:square;mso-width-percent:0;mso-height-percent:0;mso-wrap-distance-left:9pt;mso-wrap-distance-top:0;mso-wrap-distance-right:9pt;mso-wrap-distance-bottom:0;mso-position-horizontal:absolute;mso-position-horizontal-relative:margin;mso-position-vertical:absolute;mso-position-vertical-relative:page;mso-width-percent:0;mso-height-percent:0;mso-width-relative:margin;mso-height-relative:margin;v-text-anchor:middle" o:gfxdata="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" strokecolor="black [3200]" strokeweight="2pt">
+              <v:shape id="Double Bracket 1" o:spid="_x0000_s1034" type="#_x0000_t185" style="position:absolute;margin-left:346.2pt;margin-top:109.85pt;width:68.85pt;height:24.15pt;z-index:251685888;visibility:visible;mso-wrap-style:square;mso-width-percent:0;mso-height-percent:0;mso-wrap-distance-left:9pt;mso-wrap-distance-top:0;mso-wrap-distance-right:9pt;mso-wrap-distance-bottom:0;mso-position-horizontal:absolute;mso-position-horizontal-relative:margin;mso-position-vertical:absolute;mso-position-vertical-relative:page;mso-width-percent:0;mso-height-percent:0;mso-width-relative:margin;mso-height-relative:margin;v-text-anchor:middle" o:gfxdata="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" strokecolor="black [3200]" strokeweight="2pt">
                 <v:shadow on="t" color="black" opacity="24903f" origin=",.5" offset="0,.55556mm"/>
                 <v:path arrowok="t"/>
                 <v:textbox>
@@ -5065,12 +5179,30 @@
           <w:sz w:val="24"/>
           <w:szCs w:val="24"/>
         </w:rPr>
-        <w:t>Students are required to submit a short mid progress report, which must include the following:</w:t>
+        <w:t xml:space="preserve">Students are required to submit a short </w:t>
+      </w:r>
+      <w:proofErr w:type="gramStart"/>
+      <w:r>
+        <w:rPr>
+          <w:rFonts w:ascii="Times New Roman" w:hAnsi="Times New Roman" w:cs="Times New Roman"/>
+          <w:sz w:val="24"/>
+          <w:szCs w:val="24"/>
+        </w:rPr>
+        <w:t>mid progress</w:t>
+      </w:r>
+      <w:proofErr w:type="gramEnd"/>
+      <w:r>
+        <w:rPr>
+          <w:rFonts w:ascii="Times New Roman" w:hAnsi="Times New Roman" w:cs="Times New Roman"/>
+          <w:sz w:val="24"/>
+          <w:szCs w:val="24"/>
+        </w:rPr>
+        <w:t xml:space="preserve"> report, which must include the following:</w:t>
       </w:r>
     </w:p>
     <w:p>
       <w:pPr>
-        <w:pStyle w:val="ListParagraph"/>
+        <w:pStyle w:val="af5"/>
         <w:numPr>
           <w:ilvl w:val="0"/>
           <w:numId w:val="44"/>
@@ -5104,7 +5236,7 @@
     </w:p>
     <w:p>
       <w:pPr>
-        <w:pStyle w:val="ListParagraph"/>
+        <w:pStyle w:val="af5"/>
         <w:numPr>
           <w:ilvl w:val="1"/>
           <w:numId w:val="43"/>
@@ -5138,7 +5270,7 @@
     </w:p>
     <w:p>
       <w:pPr>
-        <w:pStyle w:val="ListParagraph"/>
+        <w:pStyle w:val="af5"/>
         <w:numPr>
           <w:ilvl w:val="1"/>
           <w:numId w:val="43"/>
@@ -5162,7 +5294,7 @@
     </w:p>
     <w:p>
       <w:pPr>
-        <w:pStyle w:val="ListParagraph"/>
+        <w:pStyle w:val="af5"/>
         <w:numPr>
           <w:ilvl w:val="0"/>
           <w:numId w:val="44"/>
@@ -5196,7 +5328,7 @@
     </w:p>
     <w:p>
       <w:pPr>
-        <w:pStyle w:val="ListParagraph"/>
+        <w:pStyle w:val="af5"/>
         <w:numPr>
           <w:ilvl w:val="0"/>
           <w:numId w:val="44"/>
@@ -5230,7 +5362,7 @@
     </w:p>
     <w:p>
       <w:pPr>
-        <w:pStyle w:val="ListParagraph"/>
+        <w:pStyle w:val="af5"/>
         <w:numPr>
           <w:ilvl w:val="0"/>
           <w:numId w:val="44"/>
@@ -5264,7 +5396,7 @@
     </w:p>
     <w:p>
       <w:pPr>
-        <w:pStyle w:val="ListParagraph"/>
+        <w:pStyle w:val="af5"/>
         <w:numPr>
           <w:ilvl w:val="0"/>
           <w:numId w:val="44"/>
@@ -5342,7 +5474,7 @@
     </w:p>
     <w:p>
       <w:pPr>
-        <w:pStyle w:val="Heading1"/>
+        <w:pStyle w:val="1"/>
         <w:spacing w:before="240" w:after="160"/>
         <w:rPr>
           <w:sz w:val="28"/>
@@ -5378,7 +5510,7 @@
     </w:p>
     <w:p>
       <w:pPr>
-        <w:pStyle w:val="ListParagraph"/>
+        <w:pStyle w:val="af5"/>
         <w:numPr>
           <w:ilvl w:val="0"/>
           <w:numId w:val="43"/>
@@ -5412,7 +5544,7 @@
     </w:p>
     <w:p>
       <w:pPr>
-        <w:pStyle w:val="ListParagraph"/>
+        <w:pStyle w:val="af5"/>
         <w:numPr>
           <w:ilvl w:val="0"/>
           <w:numId w:val="43"/>
@@ -5464,7 +5596,7 @@
     </w:p>
     <w:p>
       <w:pPr>
-        <w:pStyle w:val="ListParagraph"/>
+        <w:pStyle w:val="af5"/>
         <w:numPr>
           <w:ilvl w:val="1"/>
           <w:numId w:val="43"/>
@@ -5488,7 +5620,7 @@
     </w:p>
     <w:p>
       <w:pPr>
-        <w:pStyle w:val="ListParagraph"/>
+        <w:pStyle w:val="af5"/>
         <w:numPr>
           <w:ilvl w:val="1"/>
           <w:numId w:val="43"/>
@@ -5512,7 +5644,7 @@
     </w:p>
     <w:p>
       <w:pPr>
-        <w:pStyle w:val="ListParagraph"/>
+        <w:pStyle w:val="af5"/>
         <w:numPr>
           <w:ilvl w:val="1"/>
           <w:numId w:val="43"/>
@@ -5559,7 +5691,25 @@
           <w:sz w:val="24"/>
           <w:szCs w:val="24"/>
         </w:rPr>
-        <w:t>Students must not write their report elsewhere and paste the final version in at the last minute. They also must not make a single commit containing the entire project. Both are treated as red flags regardless of the quality of the final work.</w:t>
+        <w:t xml:space="preserve">Students must not write their report elsewhere and paste the final </w:t>
+      </w:r>
+      <w:proofErr w:type="gramStart"/>
+      <w:r>
+        <w:rPr>
+          <w:rFonts w:ascii="Times New Roman" w:hAnsi="Times New Roman" w:cs="Times New Roman"/>
+          <w:sz w:val="24"/>
+          <w:szCs w:val="24"/>
+        </w:rPr>
+        <w:t>version in</w:t>
+      </w:r>
+      <w:proofErr w:type="gramEnd"/>
+      <w:r>
+        <w:rPr>
+          <w:rFonts w:ascii="Times New Roman" w:hAnsi="Times New Roman" w:cs="Times New Roman"/>
+          <w:sz w:val="24"/>
+          <w:szCs w:val="24"/>
+        </w:rPr>
+        <w:t xml:space="preserve"> at the last minute. They also must not make a single commit containing the entire project. Both are treated as red flags regardless of the quality of the final work.</w:t>
       </w:r>
     </w:p>
     <w:p>
@@ -5611,7 +5761,7 @@
     </w:p>
     <w:p>
       <w:pPr>
-        <w:pStyle w:val="Heading1"/>
+        <w:pStyle w:val="1"/>
         <w:spacing w:before="240" w:after="160"/>
         <w:rPr>
           <w:sz w:val="28"/>
@@ -5629,7 +5779,7 @@
     </w:p>
     <w:p>
       <w:pPr>
-        <w:pStyle w:val="ListParagraph"/>
+        <w:pStyle w:val="af5"/>
         <w:numPr>
           <w:ilvl w:val="0"/>
           <w:numId w:val="43"/>
@@ -5663,7 +5813,7 @@
     </w:p>
     <w:p>
       <w:pPr>
-        <w:pStyle w:val="ListParagraph"/>
+        <w:pStyle w:val="af5"/>
         <w:numPr>
           <w:ilvl w:val="0"/>
           <w:numId w:val="43"/>
@@ -5687,7 +5837,7 @@
     </w:p>
     <w:p>
       <w:pPr>
-        <w:pStyle w:val="ListParagraph"/>
+        <w:pStyle w:val="af5"/>
         <w:numPr>
           <w:ilvl w:val="0"/>
           <w:numId w:val="43"/>
@@ -5711,7 +5861,7 @@
     </w:p>
     <w:p>
       <w:pPr>
-        <w:pStyle w:val="ListParagraph"/>
+        <w:pStyle w:val="af5"/>
         <w:numPr>
           <w:ilvl w:val="0"/>
           <w:numId w:val="43"/>
@@ -5743,7 +5893,7 @@
     </w:p>
     <w:p>
       <w:pPr>
-        <w:pStyle w:val="ListParagraph"/>
+        <w:pStyle w:val="af5"/>
         <w:numPr>
           <w:ilvl w:val="0"/>
           <w:numId w:val="43"/>
@@ -5938,7 +6088,7 @@
     </w:p>
     <w:p>
       <w:pPr>
-        <w:pStyle w:val="ListParagraph"/>
+        <w:pStyle w:val="af5"/>
         <w:numPr>
           <w:ilvl w:val="0"/>
           <w:numId w:val="45"/>
@@ -6745,7 +6895,7 @@
     </w:p>
     <w:tbl>
       <w:tblPr>
-        <w:tblStyle w:val="TableGrid"/>
+        <w:tblStyle w:val="a8"/>
         <w:tblW w:w="0" w:type="auto"/>
         <w:tblLook w:val="04A0" w:firstRow="1" w:lastRow="0" w:firstColumn="1" w:lastColumn="0" w:noHBand="0" w:noVBand="1"/>
       </w:tblPr>
@@ -6899,25 +7049,8 @@
                 <w:sz w:val="24"/>
                 <w:szCs w:val="24"/>
               </w:rPr>
-              <w:t>Write one key decision made during this period and one problem encountered</w:t>
+              <w:t>Write one key decision made during this period and one problem encountered.</w:t>
             </w:r>
-            <w:r>
-              <w:rPr>
-                <w:rFonts w:ascii="Times New Roman" w:hAnsi="Times New Roman" w:cs="Times New Roman"/>
-                <w:sz w:val="24"/>
-                <w:szCs w:val="24"/>
-              </w:rPr>
-              <w:t>.</w:t>
-            </w:r>
-          </w:p>
-          <w:p>
-            <w:pPr>
-              <w:rPr>
-                <w:rFonts w:ascii="Times New Roman" w:hAnsi="Times New Roman" w:cs="Times New Roman"/>
-                <w:sz w:val="24"/>
-                <w:szCs w:val="24"/>
-              </w:rPr>
-            </w:pPr>
           </w:p>
         </w:tc>
       </w:tr>
@@ -6932,10 +7065,19 @@
                 <w:rFonts w:ascii="Times New Roman" w:hAnsi="Times New Roman" w:cs="Times New Roman"/>
                 <w:b/>
                 <w:bCs/>
-                <w:sz w:val="28"/>
-                <w:szCs w:val="28"/>
+                <w:sz w:val="24"/>
+                <w:szCs w:val="24"/>
               </w:rPr>
             </w:pPr>
+            <w:r>
+              <w:rPr>
+                <w:rFonts w:ascii="Times New Roman" w:hAnsi="Times New Roman" w:cs="Times New Roman"/>
+                <w:color w:val="000000"/>
+                <w:sz w:val="24"/>
+                <w:szCs w:val="24"/>
+              </w:rPr>
+              <w:t>Leen Madkhal</w:t>
+            </w:r>
           </w:p>
         </w:tc>
         <w:tc>
@@ -6944,14 +7086,11 @@
           </w:tcPr>
           <w:p>
             <w:pPr>
-              <w:rPr>
-                <w:rFonts w:ascii="Times New Roman" w:hAnsi="Times New Roman" w:cs="Times New Roman"/>
-                <w:b/>
-                <w:bCs/>
-                <w:sz w:val="28"/>
-                <w:szCs w:val="28"/>
-              </w:rPr>
+              <w:pStyle w:val="pdq2pgselectionanchorcontainer"/>
             </w:pPr>
+            <w:r>
+              <w:t>Created the shared Google Docs, organized the project documentation, created the GitHub repository, managed the project links, and maintained the project version history.</w:t>
+            </w:r>
           </w:p>
         </w:tc>
       </w:tr>
@@ -6978,18 +7117,171 @@
     </w:p>
     <w:p>
       <w:pPr>
-        <w:rPr>
-          <w:rFonts w:asciiTheme="majorBidi" w:hAnsiTheme="majorBidi" w:cstheme="majorBidi"/>
-          <w:sz w:val="24"/>
-          <w:szCs w:val="24"/>
-        </w:rPr>
-      </w:pPr>
+        <w:pStyle w:val="TableText"/>
+        <w:rPr>
+          <w:rFonts w:ascii="Times New Roman" w:hAnsi="Times New Roman" w:cs="Times New Roman"/>
+          <w:b/>
+          <w:bCs/>
+          <w:sz w:val="24"/>
+          <w:szCs w:val="24"/>
+        </w:rPr>
+      </w:pPr>
+      <w:r>
+        <w:rPr>
+          <w:rFonts w:ascii="Times New Roman" w:hAnsi="Times New Roman" w:cs="Times New Roman"/>
+          <w:b/>
+          <w:bCs/>
+          <w:sz w:val="24"/>
+          <w:szCs w:val="24"/>
+        </w:rPr>
+        <w:t>Project Artifacts</w:t>
+      </w:r>
+    </w:p>
+    <w:p>
+      <w:pPr>
+        <w:rPr>
+          <w:rFonts w:ascii="Times New Roman" w:hAnsi="Times New Roman" w:cs="Times New Roman"/>
+          <w:sz w:val="24"/>
+          <w:szCs w:val="24"/>
+        </w:rPr>
+      </w:pPr>
+      <w:hyperlink r:id="rId19" w:history="1">
+        <w:r>
+          <w:rPr>
+            <w:rStyle w:val="Hyperlink"/>
+            <w:rFonts w:ascii="Times New Roman" w:hAnsi="Times New Roman" w:cs="Times New Roman"/>
+            <w:sz w:val="24"/>
+            <w:szCs w:val="24"/>
+          </w:rPr>
+          <w:t>https://docs.google.com/document/d/1iNI1Pd6VvxZpmyuhZ1DqjtxJxiW8lPEoVRPk6LgQZo8/edit?usp=sharing</w:t>
+        </w:r>
+      </w:hyperlink>
+    </w:p>
+    <w:p>
+      <w:pPr>
+        <w:pStyle w:val="TableText"/>
+        <w:rPr>
+          <w:rFonts w:ascii="Times New Roman" w:hAnsi="Times New Roman" w:cs="Times New Roman"/>
+          <w:sz w:val="24"/>
+          <w:szCs w:val="24"/>
+        </w:rPr>
+      </w:pPr>
+      <w:r>
+        <w:rPr>
+          <w:rFonts w:ascii="Times New Roman" w:hAnsi="Times New Roman" w:cs="Times New Roman"/>
+          <w:sz w:val="24"/>
+          <w:szCs w:val="24"/>
+        </w:rPr>
+        <w:t xml:space="preserve">GitHub Repository: </w:t>
+      </w:r>
+    </w:p>
+    <w:p>
+      <w:pPr>
+        <w:rPr>
+          <w:rFonts w:ascii="Times New Roman" w:hAnsi="Times New Roman" w:cs="Times New Roman"/>
+          <w:sz w:val="24"/>
+          <w:szCs w:val="24"/>
+        </w:rPr>
+      </w:pPr>
+      <w:hyperlink r:id="rId20" w:history="1">
+        <w:r>
+          <w:rPr>
+            <w:rStyle w:val="Hyperlink"/>
+            <w:rFonts w:ascii="Times New Roman" w:hAnsi="Times New Roman" w:cs="Times New Roman"/>
+            <w:sz w:val="24"/>
+            <w:szCs w:val="24"/>
+          </w:rPr>
+          <w:t>https://github.com/username/DS360-Network-Project</w:t>
+        </w:r>
+      </w:hyperlink>
+    </w:p>
+    <w:p>
+      <w:pPr>
+        <w:rPr>
+          <w:rFonts w:ascii="Times New Roman" w:hAnsi="Times New Roman" w:cs="Times New Roman"/>
+          <w:sz w:val="24"/>
+          <w:szCs w:val="24"/>
+        </w:rPr>
+      </w:pPr>
+    </w:p>
+    <w:p>
+      <w:pPr>
+        <w:rPr>
+          <w:rFonts w:ascii="Times New Roman" w:hAnsi="Times New Roman" w:cs="Times New Roman"/>
+          <w:sz w:val="24"/>
+          <w:szCs w:val="24"/>
+        </w:rPr>
+      </w:pPr>
+      <w:r>
+        <w:rPr>
+          <w:rFonts w:ascii="Times New Roman" w:hAnsi="Times New Roman" w:cs="Times New Roman"/>
+          <w:b/>
+          <w:bCs/>
+          <w:sz w:val="24"/>
+          <w:szCs w:val="24"/>
+        </w:rPr>
+        <w:t>References</w:t>
+      </w:r>
+    </w:p>
+    <w:p>
+      <w:pPr>
+        <w:pStyle w:val="TableText"/>
+        <w:rPr>
+          <w:rFonts w:ascii="Times New Roman" w:hAnsi="Times New Roman" w:cs="Times New Roman"/>
+          <w:sz w:val="24"/>
+          <w:szCs w:val="24"/>
+        </w:rPr>
+      </w:pPr>
+      <w:r>
+        <w:rPr>
+          <w:rFonts w:ascii="Times New Roman" w:hAnsi="Times New Roman" w:cs="Times New Roman"/>
+          <w:sz w:val="24"/>
+          <w:szCs w:val="24"/>
+        </w:rPr>
+        <w:t>Cisco Networking Academy. (2024). Introduction to Networks.</w:t>
+      </w:r>
+    </w:p>
+    <w:p>
+      <w:pPr>
+        <w:pStyle w:val="TableText"/>
+        <w:rPr>
+          <w:rFonts w:ascii="Times New Roman" w:hAnsi="Times New Roman" w:cs="Times New Roman"/>
+          <w:sz w:val="24"/>
+          <w:szCs w:val="24"/>
+        </w:rPr>
+      </w:pPr>
+      <w:r>
+        <w:rPr>
+          <w:rFonts w:ascii="Times New Roman" w:hAnsi="Times New Roman" w:cs="Times New Roman"/>
+          <w:sz w:val="24"/>
+          <w:szCs w:val="24"/>
+        </w:rPr>
+        <w:t>Cisco Systems. Cisco Packet Tracer.</w:t>
+      </w:r>
+    </w:p>
+    <w:p>
+      <w:pPr>
+        <w:pStyle w:val="TableText"/>
+        <w:rPr>
+          <w:rFonts w:ascii="Times New Roman" w:hAnsi="Times New Roman" w:cs="Times New Roman"/>
+          <w:sz w:val="24"/>
+          <w:szCs w:val="24"/>
+        </w:rPr>
+      </w:pPr>
+      <w:r>
+        <w:rPr>
+          <w:rFonts w:ascii="Times New Roman" w:hAnsi="Times New Roman" w:cs="Times New Roman"/>
+          <w:sz w:val="24"/>
+          <w:szCs w:val="24"/>
+        </w:rPr>
+        <w:t>Saudi Electronic University. DS360 Course Materials.</w:t>
+      </w:r>
     </w:p>
     <w:sectPr>
-      <w:headerReference w:type="default" r:id="rId19"/>
-      <w:footerReference w:type="even" r:id="rId20"/>
-      <w:footerReference w:type="default" r:id="rId21"/>
-      <w:footerReference w:type="first" r:id="rId22"/>
+      <w:headerReference w:type="default" r:id="rId21"/>
+      <w:footerReference w:type="even" r:id="rId22"/>
+      <w:footerReference w:type="default" r:id="rId23"/>
+      <w:footerReference w:type="first" r:id="rId24"/>
       <w:pgSz w:w="12240" w:h="15840" w:code="1"/>
       <w:pgMar w:top="1080" w:right="720" w:bottom="2160" w:left="3096" w:header="1080" w:footer="720" w:gutter="0"/>
       <w:pgNumType w:start="1"/>
@@ -7033,7 +7325,7 @@
 <w:ftr xmlns:wpc="http://schemas.microsoft.com/office/word/2010/wordprocessingCanvas" xmlns:cx="http://schemas.microsoft.com/office/drawing/2014/chartex" xmlns:cx1="http://schemas.microsoft.com/office/drawing/2015/9/8/chartex" xmlns:cx2="http://schemas.microsoft.com/office/drawing/2015/10/21/chartex" xmlns:cx3="http://schemas.microsoft.com/office/drawing/2016/5/9/chartex" xmlns:cx4="http://schemas.microsoft.com/office/drawing/2016/5/10/chartex" xmlns:cx5="http://schemas.microsoft.com/office/drawing/2016/5/11/chartex" xmlns:cx6="http://schemas.microsoft.com/office/drawing/2016/5/12/chartex" xmlns:cx7="http://schemas.microsoft.com/office/drawing/2016/5/13/chartex" xmlns:cx8="http://schemas.microsoft.com/office/drawing/2016/5/14/chartex" xmlns:mc="http://schemas.openxmlformats.org/markup-compatibility/2006" xmlns:aink="http://schemas.microsoft.com/office/drawing/2016/ink" xmlns:am3d="http://schemas.microsoft.com/office/drawing/2017/model3d" xmlns:o="urn:schemas-microsoft-com:office:office" xmlns:oel="http://schemas.microsoft.com/office/2019/extlst" xmlns:r="http://schemas.openxmlformats.org/officeDocument/2006/relationships" xmlns:m="http://schemas.openxmlformats.org/officeDocument/2006/math" xmlns:v="urn:schemas-microsoft-com:vml" xmlns:wp14="http://schemas.microsoft.com/office/word/2010/wordprocessingDrawing" xmlns:wp="http://schemas.openxmlformats.org/drawingml/2006/wordprocessingDrawing" xmlns:w10="urn:schemas-microsoft-com:office:word" xmlns:w="http://schemas.openxmlformats.org/wordprocessingml/2006/main" xmlns:w14="http://schemas.microsoft.com/office/word/2010/wordml" xmlns:w15="http://schemas.microsoft.com/office/word/2012/wordml" xmlns:w16cex="http://schemas.microsoft.com/office/word/2018/wordml/cex" xmlns:w16cid="http://schemas.microsoft.com/office/word/2016/wordml/cid" xmlns:w16="http://schemas.microsoft.com/office/word/2018/wordml" xmlns:w16du="http://schemas.microsoft.com/office/word/2023/wordml/word16du" xmlns:w16sdtdh="http://schemas.microsoft.com/office/word/2020/wordml/sdtdatahash" xmlns:w16sdtfl="http://schemas.microsoft.com/office/word/2024/wordml/sdtformatlock" xmlns:w16se="http://schemas.microsoft.com/office/word/2015/wordml/symex" xmlns:wpg="http://schemas.microsoft.com/office/word/2010/wordprocessingGroup" xmlns:wpi="http://schemas.microsoft.com/office/word/2010/wordprocessingInk" xmlns:wne="http://schemas.microsoft.com/office/word/2006/wordml" xmlns:wps="http://schemas.microsoft.com/office/word/2010/wordprocessingShape" mc:Ignorable="w14 w15 w16se w16cid w16 w16cex w16sdtdh w16sdtfl w16du wp14">
   <w:p>
     <w:pPr>
-      <w:pStyle w:val="Footer"/>
+      <w:pStyle w:val="a5"/>
     </w:pPr>
     <w:r>
       <w:rPr>
@@ -7137,7 +7429,7 @@
               <v:stroke joinstyle="miter"/>
               <v:path gradientshapeok="t" o:connecttype="rect"/>
             </v:shapetype>
-            <v:shape id="_x0000_s1035" type="#_x0000_t202" alt="Restricted - مقيد " style="position:absolute;left:0;text-align:left;margin-left:0;margin-top:0;width:34.95pt;height:34.95pt;z-index:251663360;visibility:visible;mso-wrap-style:none;mso-wrap-distance-left:0;mso-wrap-distance-top:0;mso-wrap-distance-right:0;mso-wrap-distance-bottom:0;mso-position-horizontal:left;mso-position-horizontal-relative:page;mso-position-vertical:bottom;mso-position-vertical-relative:page;v-text-anchor:bottom" o:gfxdata="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" filled="f" stroked="f">
+            <v:shape id="_x0000_s1035" type="#_x0000_t202" alt="Restricted - مقيد " style="position:absolute;left:0;text-align:left;margin-left:0;margin-top:0;width:34.95pt;height:34.95pt;z-index:251663360;visibility:visible;mso-wrap-style:none;mso-wrap-distance-left:0;mso-wrap-distance-top:0;mso-wrap-distance-right:0;mso-wrap-distance-bottom:0;mso-position-horizontal:left;mso-position-horizontal-relative:page;mso-position-vertical:bottom;mso-position-vertical-relative:page;v-text-anchor:bottom" o:gfxdata="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" filled="f" stroked="f">
               <v:textbox style="mso-fit-shape-to-text:t" inset="20pt,0,0,15pt">
                 <w:txbxContent>
                   <w:p>
@@ -7191,7 +7483,7 @@
 <w:ftr xmlns:wpc="http://schemas.microsoft.com/office/word/2010/wordprocessingCanvas" xmlns:cx="http://schemas.microsoft.com/office/drawing/2014/chartex" xmlns:cx1="http://schemas.microsoft.com/office/drawing/2015/9/8/chartex" xmlns:cx2="http://schemas.microsoft.com/office/drawing/2015/10/21/chartex" xmlns:cx3="http://schemas.microsoft.com/office/drawing/2016/5/9/chartex" xmlns:cx4="http://schemas.microsoft.com/office/drawing/2016/5/10/chartex" xmlns:cx5="http://schemas.microsoft.com/office/drawing/2016/5/11/chartex" xmlns:cx6="http://schemas.microsoft.com/office/drawing/2016/5/12/chartex" xmlns:cx7="http://schemas.microsoft.com/office/drawing/2016/5/13/chartex" xmlns:cx8="http://schemas.microsoft.com/office/drawing/2016/5/14/chartex" xmlns:mc="http://schemas.openxmlformats.org/markup-compatibility/2006" xmlns:aink="http://schemas.microsoft.com/office/drawing/2016/ink" xmlns:am3d="http://schemas.microsoft.com/office/drawing/2017/model3d" xmlns:o="urn:schemas-microsoft-com:office:office" xmlns:oel="http://schemas.microsoft.com/office/2019/extlst" xmlns:r="http://schemas.openxmlformats.org/officeDocument/2006/relationships" xmlns:m="http://schemas.openxmlformats.org/officeDocument/2006/math" xmlns:v="urn:schemas-microsoft-com:vml" xmlns:wp14="http://schemas.microsoft.com/office/word/2010/wordprocessingDrawing" xmlns:wp="http://schemas.openxmlformats.org/drawingml/2006/wordprocessingDrawing" xmlns:w10="urn:schemas-microsoft-com:office:word" xmlns:w="http://schemas.openxmlformats.org/wordprocessingml/2006/main" xmlns:w14="http://schemas.microsoft.com/office/word/2010/wordml" xmlns:w15="http://schemas.microsoft.com/office/word/2012/wordml" xmlns:w16cex="http://schemas.microsoft.com/office/word/2018/wordml/cex" xmlns:w16cid="http://schemas.microsoft.com/office/word/2016/wordml/cid" xmlns:w16="http://schemas.microsoft.com/office/word/2018/wordml" xmlns:w16du="http://schemas.microsoft.com/office/word/2023/wordml/word16du" xmlns:w16sdtdh="http://schemas.microsoft.com/office/word/2020/wordml/sdtdatahash" xmlns:w16sdtfl="http://schemas.microsoft.com/office/word/2024/wordml/sdtformatlock" xmlns:w16se="http://schemas.microsoft.com/office/word/2015/wordml/symex" xmlns:wpg="http://schemas.microsoft.com/office/word/2010/wordprocessingGroup" xmlns:wpi="http://schemas.microsoft.com/office/word/2010/wordprocessingInk" xmlns:wne="http://schemas.microsoft.com/office/word/2006/wordml" xmlns:wps="http://schemas.microsoft.com/office/word/2010/wordprocessingShape" mc:Ignorable="w14 w15 w16se w16cid w16 w16cex w16sdtdh w16sdtfl w16du wp14">
   <w:p>
     <w:pPr>
-      <w:pStyle w:val="Footer"/>
+      <w:pStyle w:val="a5"/>
     </w:pPr>
     <w:r>
       <w:rPr>
@@ -7295,7 +7587,7 @@
               <v:stroke joinstyle="miter"/>
               <v:path gradientshapeok="t" o:connecttype="rect"/>
             </v:shapetype>
-            <v:shape id="Text Box 3" o:spid="_x0000_s1036" type="#_x0000_t202" alt="Restricted - مقيد " style="position:absolute;left:0;text-align:left;margin-left:0;margin-top:0;width:34.95pt;height:34.95pt;z-index:251664384;visibility:visible;mso-wrap-style:none;mso-wrap-distance-left:0;mso-wrap-distance-top:0;mso-wrap-distance-right:0;mso-wrap-distance-bottom:0;mso-position-horizontal:left;mso-position-horizontal-relative:page;mso-position-vertical:bottom;mso-position-vertical-relative:page;v-text-anchor:bottom" o:gfxdata="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" filled="f" stroked="f">
+            <v:shape id="Text Box 3" o:spid="_x0000_s1036" type="#_x0000_t202" alt="Restricted - مقيد " style="position:absolute;left:0;text-align:left;margin-left:0;margin-top:0;width:34.95pt;height:34.95pt;z-index:251664384;visibility:visible;mso-wrap-style:none;mso-wrap-distance-left:0;mso-wrap-distance-top:0;mso-wrap-distance-right:0;mso-wrap-distance-bottom:0;mso-position-horizontal:left;mso-position-horizontal-relative:page;mso-position-vertical:bottom;mso-position-vertical-relative:page;v-text-anchor:bottom" o:gfxdata="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" filled="f" stroked="f">
               <v:textbox style="mso-fit-shape-to-text:t" inset="20pt,0,0,15pt">
                 <w:txbxContent>
                   <w:p>
@@ -7349,7 +7641,7 @@
 <w:ftr xmlns:wpc="http://schemas.microsoft.com/office/word/2010/wordprocessingCanvas" xmlns:cx="http://schemas.microsoft.com/office/drawing/2014/chartex" xmlns:cx1="http://schemas.microsoft.com/office/drawing/2015/9/8/chartex" xmlns:cx2="http://schemas.microsoft.com/office/drawing/2015/10/21/chartex" xmlns:cx3="http://schemas.microsoft.com/office/drawing/2016/5/9/chartex" xmlns:cx4="http://schemas.microsoft.com/office/drawing/2016/5/10/chartex" xmlns:cx5="http://schemas.microsoft.com/office/drawing/2016/5/11/chartex" xmlns:cx6="http://schemas.microsoft.com/office/drawing/2016/5/12/chartex" xmlns:cx7="http://schemas.microsoft.com/office/drawing/2016/5/13/chartex" xmlns:cx8="http://schemas.microsoft.com/office/drawing/2016/5/14/chartex" xmlns:mc="http://schemas.openxmlformats.org/markup-compatibility/2006" xmlns:aink="http://schemas.microsoft.com/office/drawing/2016/ink" xmlns:am3d="http://schemas.microsoft.com/office/drawing/2017/model3d" xmlns:o="urn:schemas-microsoft-com:office:office" xmlns:oel="http://schemas.microsoft.com/office/2019/extlst" xmlns:r="http://schemas.openxmlformats.org/officeDocument/2006/relationships" xmlns:m="http://schemas.openxmlformats.org/officeDocument/2006/math" xmlns:v="urn:schemas-microsoft-com:vml" xmlns:wp14="http://schemas.microsoft.com/office/word/2010/wordprocessingDrawing" xmlns:wp="http://schemas.openxmlformats.org/drawingml/2006/wordprocessingDrawing" xmlns:w10="urn:schemas-microsoft-com:office:word" xmlns:w="http://schemas.openxmlformats.org/wordprocessingml/2006/main" xmlns:w14="http://schemas.microsoft.com/office/word/2010/wordml" xmlns:w15="http://schemas.microsoft.com/office/word/2012/wordml" xmlns:w16cex="http://schemas.microsoft.com/office/word/2018/wordml/cex" xmlns:w16cid="http://schemas.microsoft.com/office/word/2016/wordml/cid" xmlns:w16="http://schemas.microsoft.com/office/word/2018/wordml" xmlns:w16du="http://schemas.microsoft.com/office/word/2023/wordml/word16du" xmlns:w16sdtdh="http://schemas.microsoft.com/office/word/2020/wordml/sdtdatahash" xmlns:w16sdtfl="http://schemas.microsoft.com/office/word/2024/wordml/sdtformatlock" xmlns:w16se="http://schemas.microsoft.com/office/word/2015/wordml/symex" xmlns:wpg="http://schemas.microsoft.com/office/word/2010/wordprocessingGroup" xmlns:wpi="http://schemas.microsoft.com/office/word/2010/wordprocessingInk" xmlns:wne="http://schemas.microsoft.com/office/word/2006/wordml" xmlns:wps="http://schemas.microsoft.com/office/word/2010/wordprocessingShape" mc:Ignorable="w14 w15 w16se w16cid w16 w16cex w16sdtdh w16sdtfl w16du wp14">
   <w:p>
     <w:pPr>
-      <w:pStyle w:val="Footer"/>
+      <w:pStyle w:val="a5"/>
     </w:pPr>
     <w:r>
       <w:rPr>
@@ -7453,7 +7745,7 @@
               <v:stroke joinstyle="miter"/>
               <v:path gradientshapeok="t" o:connecttype="rect"/>
             </v:shapetype>
-            <v:shape id="Text Box 1" o:spid="_x0000_s1037" type="#_x0000_t202" alt="Restricted - مقيد " style="position:absolute;left:0;text-align:left;margin-left:0;margin-top:0;width:34.95pt;height:34.95pt;z-index:251662336;visibility:visible;mso-wrap-style:none;mso-wrap-distance-left:0;mso-wrap-distance-top:0;mso-wrap-distance-right:0;mso-wrap-distance-bottom:0;mso-position-horizontal:left;mso-position-horizontal-relative:page;mso-position-vertical:bottom;mso-position-vertical-relative:page;v-text-anchor:bottom" o:gfxdata="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" filled="f" stroked="f">
+            <v:shape id="Text Box 1" o:spid="_x0000_s1037" type="#_x0000_t202" alt="Restricted - مقيد " style="position:absolute;left:0;text-align:left;margin-left:0;margin-top:0;width:34.95pt;height:34.95pt;z-index:251662336;visibility:visible;mso-wrap-style:none;mso-wrap-distance-left:0;mso-wrap-distance-top:0;mso-wrap-distance-right:0;mso-wrap-distance-bottom:0;mso-position-horizontal:left;mso-position-horizontal-relative:page;mso-position-vertical:bottom;mso-position-vertical-relative:page;v-text-anchor:bottom" o:gfxdata="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" filled="f" stroked="f">
               <v:textbox style="mso-fit-shape-to-text:t" inset="20pt,0,0,15pt">
                 <w:txbxContent>
                   <w:p>
@@ -7507,7 +7799,7 @@
 <w:ftr xmlns:wpc="http://schemas.microsoft.com/office/word/2010/wordprocessingCanvas" xmlns:cx="http://schemas.microsoft.com/office/drawing/2014/chartex" xmlns:cx1="http://schemas.microsoft.com/office/drawing/2015/9/8/chartex" xmlns:cx2="http://schemas.microsoft.com/office/drawing/2015/10/21/chartex" xmlns:cx3="http://schemas.microsoft.com/office/drawing/2016/5/9/chartex" xmlns:cx4="http://schemas.microsoft.com/office/drawing/2016/5/10/chartex" xmlns:cx5="http://schemas.microsoft.com/office/drawing/2016/5/11/chartex" xmlns:cx6="http://schemas.microsoft.com/office/drawing/2016/5/12/chartex" xmlns:cx7="http://schemas.microsoft.com/office/drawing/2016/5/13/chartex" xmlns:cx8="http://schemas.microsoft.com/office/drawing/2016/5/14/chartex" xmlns:mc="http://schemas.openxmlformats.org/markup-compatibility/2006" xmlns:aink="http://schemas.microsoft.com/office/drawing/2016/ink" xmlns:am3d="http://schemas.microsoft.com/office/drawing/2017/model3d" xmlns:o="urn:schemas-microsoft-com:office:office" xmlns:oel="http://schemas.microsoft.com/office/2019/extlst" xmlns:r="http://schemas.openxmlformats.org/officeDocument/2006/relationships" xmlns:m="http://schemas.openxmlformats.org/officeDocument/2006/math" xmlns:v="urn:schemas-microsoft-com:vml" xmlns:wp14="http://schemas.microsoft.com/office/word/2010/wordprocessingDrawing" xmlns:wp="http://schemas.openxmlformats.org/drawingml/2006/wordprocessingDrawing" xmlns:w10="urn:schemas-microsoft-com:office:word" xmlns:w="http://schemas.openxmlformats.org/wordprocessingml/2006/main" xmlns:w14="http://schemas.microsoft.com/office/word/2010/wordml" xmlns:w15="http://schemas.microsoft.com/office/word/2012/wordml" xmlns:w16cex="http://schemas.microsoft.com/office/word/2018/wordml/cex" xmlns:w16cid="http://schemas.microsoft.com/office/word/2016/wordml/cid" xmlns:w16="http://schemas.microsoft.com/office/word/2018/wordml" xmlns:w16du="http://schemas.microsoft.com/office/word/2023/wordml/word16du" xmlns:w16sdtdh="http://schemas.microsoft.com/office/word/2020/wordml/sdtdatahash" xmlns:w16sdtfl="http://schemas.microsoft.com/office/word/2024/wordml/sdtformatlock" xmlns:w16se="http://schemas.microsoft.com/office/word/2015/wordml/symex" xmlns:wpg="http://schemas.microsoft.com/office/word/2010/wordprocessingGroup" xmlns:wpi="http://schemas.microsoft.com/office/word/2010/wordprocessingInk" xmlns:wne="http://schemas.microsoft.com/office/word/2006/wordml" xmlns:wps="http://schemas.microsoft.com/office/word/2010/wordprocessingShape" mc:Ignorable="w14 w15 w16se w16cid w16 w16cex w16sdtdh w16sdtfl w16du wp14">
   <w:p>
     <w:pPr>
-      <w:pStyle w:val="Footer"/>
+      <w:pStyle w:val="a5"/>
     </w:pPr>
     <w:r>
       <w:rPr>
@@ -7611,7 +7903,7 @@
               <v:stroke joinstyle="miter"/>
               <v:path gradientshapeok="t" o:connecttype="rect"/>
             </v:shapetype>
-            <v:shape id="_x0000_s1038" type="#_x0000_t202" alt="Restricted - مقيد " style="position:absolute;left:0;text-align:left;margin-left:0;margin-top:0;width:34.95pt;height:34.95pt;z-index:251666432;visibility:visible;mso-wrap-style:none;mso-wrap-distance-left:0;mso-wrap-distance-top:0;mso-wrap-distance-right:0;mso-wrap-distance-bottom:0;mso-position-horizontal:left;mso-position-horizontal-relative:page;mso-position-vertical:bottom;mso-position-vertical-relative:page;v-text-anchor:bottom" o:gfxdata="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" filled="f" stroked="f">
+            <v:shape id="_x0000_s1038" type="#_x0000_t202" alt="Restricted - مقيد " style="position:absolute;left:0;text-align:left;margin-left:0;margin-top:0;width:34.95pt;height:34.95pt;z-index:251666432;visibility:visible;mso-wrap-style:none;mso-wrap-distance-left:0;mso-wrap-distance-top:0;mso-wrap-distance-right:0;mso-wrap-distance-bottom:0;mso-position-horizontal:left;mso-position-horizontal-relative:page;mso-position-vertical:bottom;mso-position-vertical-relative:page;v-text-anchor:bottom" o:gfxdata="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" filled="f" stroked="f">
               <v:textbox style="mso-fit-shape-to-text:t" inset="20pt,0,0,15pt">
                 <w:txbxContent>
                   <w:p>
@@ -7665,7 +7957,7 @@
 <w:ftr xmlns:wpc="http://schemas.microsoft.com/office/word/2010/wordprocessingCanvas" xmlns:cx="http://schemas.microsoft.com/office/drawing/2014/chartex" xmlns:cx1="http://schemas.microsoft.com/office/drawing/2015/9/8/chartex" xmlns:cx2="http://schemas.microsoft.com/office/drawing/2015/10/21/chartex" xmlns:cx3="http://schemas.microsoft.com/office/drawing/2016/5/9/chartex" xmlns:cx4="http://schemas.microsoft.com/office/drawing/2016/5/10/chartex" xmlns:cx5="http://schemas.microsoft.com/office/drawing/2016/5/11/chartex" xmlns:cx6="http://schemas.microsoft.com/office/drawing/2016/5/12/chartex" xmlns:cx7="http://schemas.microsoft.com/office/drawing/2016/5/13/chartex" xmlns:cx8="http://schemas.microsoft.com/office/drawing/2016/5/14/chartex" xmlns:mc="http://schemas.openxmlformats.org/markup-compatibility/2006" xmlns:aink="http://schemas.microsoft.com/office/drawing/2016/ink" xmlns:am3d="http://schemas.microsoft.com/office/drawing/2017/model3d" xmlns:o="urn:schemas-microsoft-com:office:office" xmlns:oel="http://schemas.microsoft.com/office/2019/extlst" xmlns:r="http://schemas.openxmlformats.org/officeDocument/2006/relationships" xmlns:m="http://schemas.openxmlformats.org/officeDocument/2006/math" xmlns:v="urn:schemas-microsoft-com:vml" xmlns:wp14="http://schemas.microsoft.com/office/word/2010/wordprocessingDrawing" xmlns:wp="http://schemas.openxmlformats.org/drawingml/2006/wordprocessingDrawing" xmlns:w10="urn:schemas-microsoft-com:office:word" xmlns:w="http://schemas.openxmlformats.org/wordprocessingml/2006/main" xmlns:w14="http://schemas.microsoft.com/office/word/2010/wordml" xmlns:w15="http://schemas.microsoft.com/office/word/2012/wordml" xmlns:w16cex="http://schemas.microsoft.com/office/word/2018/wordml/cex" xmlns:w16cid="http://schemas.microsoft.com/office/word/2016/wordml/cid" xmlns:w16="http://schemas.microsoft.com/office/word/2018/wordml" xmlns:w16du="http://schemas.microsoft.com/office/word/2023/wordml/word16du" xmlns:w16sdtdh="http://schemas.microsoft.com/office/word/2020/wordml/sdtdatahash" xmlns:w16sdtfl="http://schemas.microsoft.com/office/word/2024/wordml/sdtformatlock" xmlns:w16se="http://schemas.microsoft.com/office/word/2015/wordml/symex" xmlns:wpg="http://schemas.microsoft.com/office/word/2010/wordprocessingGroup" xmlns:wpi="http://schemas.microsoft.com/office/word/2010/wordprocessingInk" xmlns:wne="http://schemas.microsoft.com/office/word/2006/wordml" xmlns:wps="http://schemas.microsoft.com/office/word/2010/wordprocessingShape" mc:Ignorable="w14 w15 w16se w16cid w16 w16cex w16sdtdh w16sdtfl w16du wp14">
   <w:p>
     <w:pPr>
-      <w:pStyle w:val="Footer"/>
+      <w:pStyle w:val="a5"/>
     </w:pPr>
     <w:r>
       <w:rPr>
@@ -7744,7 +8036,7 @@
               <v:stroke joinstyle="miter"/>
               <v:path gradientshapeok="t" o:connecttype="rect"/>
             </v:shapetype>
-            <v:shape id="Text Box 6" o:spid="_x0000_s1039" type="#_x0000_t202" alt="Restricted - مقيد " style="position:absolute;left:0;text-align:left;margin-left:0;margin-top:0;width:34.95pt;height:34.95pt;z-index:251667456;visibility:visible;mso-wrap-style:none;mso-wrap-distance-left:0;mso-wrap-distance-top:0;mso-wrap-distance-right:0;mso-wrap-distance-bottom:0;mso-position-horizontal:left;mso-position-horizontal-relative:page;mso-position-vertical:bottom;mso-position-vertical-relative:page;v-text-anchor:bottom" o:gfxdata="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" filled="f" stroked="f">
+            <v:shape id="Text Box 6" o:spid="_x0000_s1039" type="#_x0000_t202" alt="Restricted - مقيد " style="position:absolute;left:0;text-align:left;margin-left:0;margin-top:0;width:34.95pt;height:34.95pt;z-index:251667456;visibility:visible;mso-wrap-style:none;mso-wrap-distance-left:0;mso-wrap-distance-top:0;mso-wrap-distance-right:0;mso-wrap-distance-bottom:0;mso-position-horizontal:left;mso-position-horizontal-relative:page;mso-position-vertical:bottom;mso-position-vertical-relative:page;v-text-anchor:bottom" o:gfxdata="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" filled="f" stroked="f">
               <v:textbox style="mso-fit-shape-to-text:t" inset="20pt,0,0,15pt">
                 <w:txbxContent>
                   <w:p>
@@ -7773,7 +8065,7 @@
 <w:ftr xmlns:wpc="http://schemas.microsoft.com/office/word/2010/wordprocessingCanvas" xmlns:cx="http://schemas.microsoft.com/office/drawing/2014/chartex" xmlns:cx1="http://schemas.microsoft.com/office/drawing/2015/9/8/chartex" xmlns:cx2="http://schemas.microsoft.com/office/drawing/2015/10/21/chartex" xmlns:cx3="http://schemas.microsoft.com/office/drawing/2016/5/9/chartex" xmlns:cx4="http://schemas.microsoft.com/office/drawing/2016/5/10/chartex" xmlns:cx5="http://schemas.microsoft.com/office/drawing/2016/5/11/chartex" xmlns:cx6="http://schemas.microsoft.com/office/drawing/2016/5/12/chartex" xmlns:cx7="http://schemas.microsoft.com/office/drawing/2016/5/13/chartex" xmlns:cx8="http://schemas.microsoft.com/office/drawing/2016/5/14/chartex" xmlns:mc="http://schemas.openxmlformats.org/markup-compatibility/2006" xmlns:aink="http://schemas.microsoft.com/office/drawing/2016/ink" xmlns:am3d="http://schemas.microsoft.com/office/drawing/2017/model3d" xmlns:o="urn:schemas-microsoft-com:office:office" xmlns:oel="http://schemas.microsoft.com/office/2019/extlst" xmlns:r="http://schemas.openxmlformats.org/officeDocument/2006/relationships" xmlns:m="http://schemas.openxmlformats.org/officeDocument/2006/math" xmlns:v="urn:schemas-microsoft-com:vml" xmlns:wp14="http://schemas.microsoft.com/office/word/2010/wordprocessingDrawing" xmlns:wp="http://schemas.openxmlformats.org/drawingml/2006/wordprocessingDrawing" xmlns:w10="urn:schemas-microsoft-com:office:word" xmlns:w="http://schemas.openxmlformats.org/wordprocessingml/2006/main" xmlns:w14="http://schemas.microsoft.com/office/word/2010/wordml" xmlns:w15="http://schemas.microsoft.com/office/word/2012/wordml" xmlns:w16cex="http://schemas.microsoft.com/office/word/2018/wordml/cex" xmlns:w16cid="http://schemas.microsoft.com/office/word/2016/wordml/cid" xmlns:w16="http://schemas.microsoft.com/office/word/2018/wordml" xmlns:w16du="http://schemas.microsoft.com/office/word/2023/wordml/word16du" xmlns:w16sdtdh="http://schemas.microsoft.com/office/word/2020/wordml/sdtdatahash" xmlns:w16sdtfl="http://schemas.microsoft.com/office/word/2024/wordml/sdtformatlock" xmlns:w16se="http://schemas.microsoft.com/office/word/2015/wordml/symex" xmlns:wpg="http://schemas.microsoft.com/office/word/2010/wordprocessingGroup" xmlns:wpi="http://schemas.microsoft.com/office/word/2010/wordprocessingInk" xmlns:wne="http://schemas.microsoft.com/office/word/2006/wordml" xmlns:wps="http://schemas.microsoft.com/office/word/2010/wordprocessingShape" mc:Ignorable="w14 w15 w16se w16cid w16 w16cex w16sdtdh w16sdtfl w16du wp14">
   <w:p>
     <w:pPr>
-      <w:pStyle w:val="Footer"/>
+      <w:pStyle w:val="a5"/>
     </w:pPr>
     <w:r>
       <w:rPr>
@@ -7877,7 +8169,7 @@
               <v:stroke joinstyle="miter"/>
               <v:path gradientshapeok="t" o:connecttype="rect"/>
             </v:shapetype>
-            <v:shape id="Text Box 4" o:spid="_x0000_s1040" type="#_x0000_t202" alt="Restricted - مقيد " style="position:absolute;left:0;text-align:left;margin-left:0;margin-top:0;width:34.95pt;height:34.95pt;z-index:251665408;visibility:visible;mso-wrap-style:none;mso-wrap-distance-left:0;mso-wrap-distance-top:0;mso-wrap-distance-right:0;mso-wrap-distance-bottom:0;mso-position-horizontal:left;mso-position-horizontal-relative:page;mso-position-vertical:bottom;mso-position-vertical-relative:page;v-text-anchor:bottom" o:gfxdata="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" filled="f" stroked="f">
+            <v:shape id="Text Box 4" o:spid="_x0000_s1040" type="#_x0000_t202" alt="Restricted - مقيد " style="position:absolute;left:0;text-align:left;margin-left:0;margin-top:0;width:34.95pt;height:34.95pt;z-index:251665408;visibility:visible;mso-wrap-style:none;mso-wrap-distance-left:0;mso-wrap-distance-top:0;mso-wrap-distance-right:0;mso-wrap-distance-bottom:0;mso-position-horizontal:left;mso-position-horizontal-relative:page;mso-position-vertical:bottom;mso-position-vertical-relative:page;v-text-anchor:bottom" o:gfxdata="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" filled="f" stroked="f">
               <v:textbox style="mso-fit-shape-to-text:t" inset="20pt,0,0,15pt">
                 <w:txbxContent>
                   <w:p>
@@ -8021,7 +8313,7 @@
         </w:tcPr>
         <w:p>
           <w:pPr>
-            <w:pStyle w:val="Header"/>
+            <w:pStyle w:val="a7"/>
           </w:pPr>
         </w:p>
       </w:tc>
@@ -8031,7 +8323,7 @@
         </w:tcPr>
         <w:p>
           <w:pPr>
-            <w:pStyle w:val="Header"/>
+            <w:pStyle w:val="a7"/>
           </w:pPr>
         </w:p>
       </w:tc>
@@ -8042,7 +8334,7 @@
         </w:tcPr>
         <w:p>
           <w:pPr>
-            <w:pStyle w:val="Header"/>
+            <w:pStyle w:val="a7"/>
           </w:pPr>
         </w:p>
       </w:tc>
@@ -8050,7 +8342,7 @@
   </w:tbl>
   <w:p>
     <w:pPr>
-      <w:pStyle w:val="Header"/>
+      <w:pStyle w:val="a7"/>
     </w:pPr>
   </w:p>
 </w:hdr>
@@ -8336,9 +8628,26 @@
           </w:r>
           <w:r>
             <w:rPr>
+              <w:rFonts w:hint="cs"/>
+              <w:noProof/>
+              <w:rtl/>
+            </w:rPr>
+            <w:instrText xml:space="preserve">خطأ! استخدم علامة التبويب "الصفحة الرئيسية" لتطبيق </w:instrText>
+          </w:r>
+          <w:r>
+            <w:rPr>
+              <w:rFonts w:hint="cs"/>
               <w:noProof/>
             </w:rPr>
-            <w:instrText>Project Instruction</w:instrText>
+            <w:instrText>Heading 1</w:instrText>
+          </w:r>
+          <w:r>
+            <w:rPr>
+              <w:rFonts w:hint="cs"/>
+              <w:noProof/>
+              <w:rtl/>
+            </w:rPr>
+            <w:instrText xml:space="preserve"> على النص الذي ترغب في أن يظهر هنا.</w:instrText>
           </w:r>
           <w:r>
             <w:rPr>
@@ -8369,9 +8678,26 @@
           </w:r>
           <w:r>
             <w:rPr>
+              <w:rFonts w:hint="cs"/>
+              <w:noProof/>
+              <w:rtl/>
+            </w:rPr>
+            <w:instrText xml:space="preserve">خطأ! استخدم علامة التبويب "الصفحة الرئيسية" لتطبيق </w:instrText>
+          </w:r>
+          <w:r>
+            <w:rPr>
+              <w:rFonts w:hint="cs"/>
               <w:noProof/>
             </w:rPr>
-            <w:instrText>Project Instruction</w:instrText>
+            <w:instrText>Heading 1</w:instrText>
+          </w:r>
+          <w:r>
+            <w:rPr>
+              <w:rFonts w:hint="cs"/>
+              <w:noProof/>
+              <w:rtl/>
+            </w:rPr>
+            <w:instrText xml:space="preserve"> على النص الذي ترغب في أن يظهر هنا.</w:instrText>
           </w:r>
           <w:r>
             <w:rPr>
@@ -8387,9 +8713,32 @@
           </w:r>
           <w:r>
             <w:rPr>
+              <w:rFonts w:hint="cs"/>
+              <w:noProof/>
+              <w:rtl/>
+            </w:rPr>
+            <w:t xml:space="preserve">خطأ! استخدم علامة التبويب "الصفحة الرئيسية" لتطبيق </w:t>
+          </w:r>
+          <w:r>
+            <w:rPr>
+              <w:rFonts w:hint="cs"/>
               <w:noProof/>
             </w:rPr>
-            <w:t xml:space="preserve">Project Instruction </w:t>
+            <w:t>Heading 1</w:t>
+          </w:r>
+          <w:r>
+            <w:rPr>
+              <w:rFonts w:hint="cs"/>
+              <w:noProof/>
+              <w:rtl/>
+            </w:rPr>
+            <w:t xml:space="preserve"> على النص الذي ترغب في أن يظهر هنا.</w:t>
+          </w:r>
+          <w:r>
+            <w:rPr>
+              <w:noProof/>
+            </w:rPr>
+            <w:t xml:space="preserve"> </w:t>
           </w:r>
           <w:r>
             <w:fldChar w:fldCharType="end"/>
@@ -8455,7 +8804,7 @@
     <w:lvl w:ilvl="0">
       <w:start w:val="1"/>
       <w:numFmt w:val="bullet"/>
-      <w:pStyle w:val="ListBullet"/>
+      <w:pStyle w:val="a"/>
       <w:lvlText w:val="•"/>
       <w:lvlJc w:val="left"/>
       <w:pPr>
@@ -10130,7 +10479,7 @@
     <w:lvl w:ilvl="0">
       <w:start w:val="1"/>
       <w:numFmt w:val="decimal"/>
-      <w:pStyle w:val="ListNumber"/>
+      <w:pStyle w:val="a0"/>
       <w:lvlText w:val="%1."/>
       <w:lvlJc w:val="left"/>
       <w:pPr>
@@ -10144,7 +10493,7 @@
     <w:lvl w:ilvl="1">
       <w:start w:val="1"/>
       <w:numFmt w:val="decimal"/>
-      <w:pStyle w:val="ListNumber2"/>
+      <w:pStyle w:val="2"/>
       <w:suff w:val="space"/>
       <w:lvlText w:val="%1.%2"/>
       <w:lvlJc w:val="left"/>
@@ -10159,7 +10508,7 @@
     <w:lvl w:ilvl="2">
       <w:start w:val="1"/>
       <w:numFmt w:val="lowerLetter"/>
-      <w:pStyle w:val="ListNumber3"/>
+      <w:pStyle w:val="3"/>
       <w:lvlText w:val="%3."/>
       <w:lvlJc w:val="left"/>
       <w:pPr>
@@ -10173,7 +10522,7 @@
     <w:lvl w:ilvl="3">
       <w:start w:val="1"/>
       <w:numFmt w:val="lowerRoman"/>
-      <w:pStyle w:val="ListNumber4"/>
+      <w:pStyle w:val="4"/>
       <w:lvlText w:val="%4."/>
       <w:lvlJc w:val="left"/>
       <w:pPr>
@@ -10187,7 +10536,7 @@
     <w:lvl w:ilvl="4">
       <w:start w:val="1"/>
       <w:numFmt w:val="lowerLetter"/>
-      <w:pStyle w:val="ListNumber5"/>
+      <w:pStyle w:val="5"/>
       <w:lvlText w:val="(%5)"/>
       <w:lvlJc w:val="left"/>
       <w:pPr>
@@ -13162,15 +13511,15 @@
     <w:lsdException w:name="Unresolved Mention" w:semiHidden="1" w:unhideWhenUsed="1"/>
     <w:lsdException w:name="Smart Link" w:semiHidden="1" w:unhideWhenUsed="1"/>
   </w:latentStyles>
-  <w:style w:type="paragraph" w:default="1" w:styleId="Normal">
+  <w:style w:type="paragraph" w:default="1" w:styleId="a1">
     <w:name w:val="Normal"/>
     <w:qFormat/>
   </w:style>
-  <w:style w:type="paragraph" w:styleId="Heading1">
+  <w:style w:type="paragraph" w:styleId="1">
     <w:name w:val="heading 1"/>
-    <w:basedOn w:val="Normal"/>
-    <w:next w:val="Normal"/>
-    <w:link w:val="Heading1Char"/>
+    <w:basedOn w:val="a1"/>
+    <w:next w:val="a1"/>
+    <w:link w:val="1Char"/>
     <w:uiPriority w:val="1"/>
     <w:qFormat/>
     <w:pPr>
@@ -13189,11 +13538,11 @@
       <w:sz w:val="40"/>
     </w:rPr>
   </w:style>
-  <w:style w:type="paragraph" w:styleId="Heading2">
+  <w:style w:type="paragraph" w:styleId="20">
     <w:name w:val="heading 2"/>
-    <w:basedOn w:val="Normal"/>
-    <w:next w:val="Normal"/>
-    <w:link w:val="Heading2Char"/>
+    <w:basedOn w:val="a1"/>
+    <w:next w:val="a1"/>
+    <w:link w:val="2Char"/>
     <w:uiPriority w:val="1"/>
     <w:unhideWhenUsed/>
     <w:qFormat/>
@@ -13211,11 +13560,11 @@
       <w:sz w:val="28"/>
     </w:rPr>
   </w:style>
-  <w:style w:type="paragraph" w:styleId="Heading3">
+  <w:style w:type="paragraph" w:styleId="30">
     <w:name w:val="heading 3"/>
-    <w:basedOn w:val="Normal"/>
-    <w:next w:val="Normal"/>
-    <w:link w:val="Heading3Char"/>
+    <w:basedOn w:val="a1"/>
+    <w:next w:val="a1"/>
+    <w:link w:val="3Char"/>
     <w:uiPriority w:val="1"/>
     <w:semiHidden/>
     <w:unhideWhenUsed/>
@@ -13234,12 +13583,12 @@
       <w:szCs w:val="24"/>
     </w:rPr>
   </w:style>
-  <w:style w:type="character" w:default="1" w:styleId="DefaultParagraphFont">
+  <w:style w:type="character" w:default="1" w:styleId="a2">
     <w:name w:val="Default Paragraph Font"/>
     <w:uiPriority w:val="1"/>
     <w:unhideWhenUsed/>
   </w:style>
-  <w:style w:type="table" w:default="1" w:styleId="TableNormal">
+  <w:style w:type="table" w:default="1" w:styleId="a3">
     <w:name w:val="Normal Table"/>
     <w:uiPriority w:val="99"/>
     <w:semiHidden/>
@@ -13254,16 +13603,16 @@
       </w:tblCellMar>
     </w:tblPr>
   </w:style>
-  <w:style w:type="numbering" w:default="1" w:styleId="NoList">
+  <w:style w:type="numbering" w:default="1" w:styleId="a4">
     <w:name w:val="No List"/>
     <w:uiPriority w:val="99"/>
     <w:semiHidden/>
     <w:unhideWhenUsed/>
   </w:style>
-  <w:style w:type="paragraph" w:styleId="Footer">
+  <w:style w:type="paragraph" w:styleId="a5">
     <w:name w:val="footer"/>
-    <w:basedOn w:val="Normal"/>
-    <w:link w:val="FooterChar"/>
+    <w:basedOn w:val="a1"/>
+    <w:link w:val="Char"/>
     <w:uiPriority w:val="99"/>
     <w:unhideWhenUsed/>
     <w:qFormat/>
@@ -13275,20 +13624,20 @@
       <w:color w:val="EF4623" w:themeColor="accent1"/>
     </w:rPr>
   </w:style>
-  <w:style w:type="character" w:customStyle="1" w:styleId="FooterChar">
-    <w:name w:val="Footer Char"/>
-    <w:basedOn w:val="DefaultParagraphFont"/>
-    <w:link w:val="Footer"/>
+  <w:style w:type="character" w:customStyle="1" w:styleId="Char">
+    <w:name w:val="تذييل الصفحة Char"/>
+    <w:basedOn w:val="a2"/>
+    <w:link w:val="a5"/>
     <w:uiPriority w:val="99"/>
     <w:rPr>
       <w:color w:val="EF4623" w:themeColor="accent1"/>
     </w:rPr>
   </w:style>
-  <w:style w:type="paragraph" w:styleId="Subtitle">
+  <w:style w:type="paragraph" w:styleId="a6">
     <w:name w:val="Subtitle"/>
-    <w:basedOn w:val="Normal"/>
-    <w:next w:val="Normal"/>
-    <w:link w:val="SubtitleChar"/>
+    <w:basedOn w:val="a1"/>
+    <w:next w:val="a1"/>
+    <w:link w:val="Char0"/>
     <w:uiPriority w:val="3"/>
     <w:unhideWhenUsed/>
     <w:qFormat/>
@@ -13311,36 +13660,36 @@
   </w:style>
   <w:style w:type="paragraph" w:customStyle="1" w:styleId="Graphic">
     <w:name w:val="Graphic"/>
-    <w:basedOn w:val="Normal"/>
+    <w:basedOn w:val="a1"/>
     <w:uiPriority w:val="99"/>
     <w:pPr>
       <w:spacing w:after="80" w:line="240" w:lineRule="auto"/>
       <w:jc w:val="center"/>
     </w:pPr>
   </w:style>
-  <w:style w:type="paragraph" w:styleId="Header">
+  <w:style w:type="paragraph" w:styleId="a7">
     <w:name w:val="header"/>
-    <w:basedOn w:val="Normal"/>
-    <w:link w:val="HeaderChar"/>
+    <w:basedOn w:val="a1"/>
+    <w:link w:val="Char1"/>
     <w:uiPriority w:val="99"/>
     <w:qFormat/>
     <w:pPr>
       <w:spacing w:after="380" w:line="240" w:lineRule="auto"/>
     </w:pPr>
   </w:style>
-  <w:style w:type="character" w:customStyle="1" w:styleId="HeaderChar">
-    <w:name w:val="Header Char"/>
-    <w:basedOn w:val="DefaultParagraphFont"/>
-    <w:link w:val="Header"/>
+  <w:style w:type="character" w:customStyle="1" w:styleId="Char1">
+    <w:name w:val="رأس الصفحة Char"/>
+    <w:basedOn w:val="a2"/>
+    <w:link w:val="a7"/>
     <w:uiPriority w:val="99"/>
     <w:rPr>
       <w:color w:val="404040" w:themeColor="text1" w:themeTint="BF"/>
       <w:sz w:val="20"/>
     </w:rPr>
   </w:style>
-  <w:style w:type="table" w:styleId="TableGrid">
+  <w:style w:type="table" w:styleId="a8">
     <w:name w:val="Table Grid"/>
-    <w:basedOn w:val="TableNormal"/>
+    <w:basedOn w:val="a3"/>
     <w:uiPriority w:val="59"/>
     <w:pPr>
       <w:spacing w:before="120" w:after="120" w:line="240" w:lineRule="auto"/>
@@ -13397,7 +13746,7 @@
   </w:style>
   <w:style w:type="paragraph" w:customStyle="1" w:styleId="InfoHeading">
     <w:name w:val="Info Heading"/>
-    <w:basedOn w:val="Normal"/>
+    <w:basedOn w:val="a1"/>
     <w:uiPriority w:val="2"/>
     <w:qFormat/>
     <w:pPr>
@@ -13414,8 +13763,8 @@
   </w:style>
   <w:style w:type="paragraph" w:customStyle="1" w:styleId="Page">
     <w:name w:val="Page"/>
-    <w:basedOn w:val="Normal"/>
-    <w:next w:val="Normal"/>
+    <w:basedOn w:val="a1"/>
+    <w:next w:val="a1"/>
     <w:uiPriority w:val="99"/>
     <w:unhideWhenUsed/>
     <w:qFormat/>
@@ -13428,11 +13777,11 @@
       <w:sz w:val="36"/>
     </w:rPr>
   </w:style>
-  <w:style w:type="paragraph" w:styleId="Title">
+  <w:style w:type="paragraph" w:styleId="a9">
     <w:name w:val="Title"/>
-    <w:basedOn w:val="Normal"/>
-    <w:next w:val="Normal"/>
-    <w:link w:val="TitleChar"/>
+    <w:basedOn w:val="a1"/>
+    <w:next w:val="a1"/>
+    <w:link w:val="Char2"/>
     <w:uiPriority w:val="2"/>
     <w:qFormat/>
     <w:pPr>
@@ -13446,10 +13795,10 @@
       <w:sz w:val="200"/>
     </w:rPr>
   </w:style>
-  <w:style w:type="character" w:customStyle="1" w:styleId="TitleChar">
-    <w:name w:val="Title Char"/>
-    <w:basedOn w:val="DefaultParagraphFont"/>
-    <w:link w:val="Title"/>
+  <w:style w:type="character" w:customStyle="1" w:styleId="Char2">
+    <w:name w:val="العنوان Char"/>
+    <w:basedOn w:val="a2"/>
+    <w:link w:val="a9"/>
     <w:uiPriority w:val="2"/>
     <w:rPr>
       <w:rFonts w:asciiTheme="majorHAnsi" w:eastAsiaTheme="majorEastAsia" w:hAnsiTheme="majorHAnsi" w:cstheme="majorBidi"/>
@@ -13459,19 +13808,19 @@
       <w:sz w:val="200"/>
     </w:rPr>
   </w:style>
-  <w:style w:type="character" w:styleId="PlaceholderText">
+  <w:style w:type="character" w:styleId="aa">
     <w:name w:val="Placeholder Text"/>
-    <w:basedOn w:val="DefaultParagraphFont"/>
+    <w:basedOn w:val="a2"/>
     <w:uiPriority w:val="99"/>
     <w:semiHidden/>
     <w:rPr>
       <w:color w:val="808080"/>
     </w:rPr>
   </w:style>
-  <w:style w:type="paragraph" w:styleId="BalloonText">
+  <w:style w:type="paragraph" w:styleId="ab">
     <w:name w:val="Balloon Text"/>
-    <w:basedOn w:val="Normal"/>
-    <w:link w:val="BalloonTextChar"/>
+    <w:basedOn w:val="a1"/>
+    <w:link w:val="Char3"/>
     <w:uiPriority w:val="99"/>
     <w:semiHidden/>
     <w:unhideWhenUsed/>
@@ -13483,10 +13832,10 @@
       <w:sz w:val="16"/>
     </w:rPr>
   </w:style>
-  <w:style w:type="character" w:customStyle="1" w:styleId="BalloonTextChar">
-    <w:name w:val="Balloon Text Char"/>
-    <w:basedOn w:val="DefaultParagraphFont"/>
-    <w:link w:val="BalloonText"/>
+  <w:style w:type="character" w:customStyle="1" w:styleId="Char3">
+    <w:name w:val="نص في بالون Char"/>
+    <w:basedOn w:val="a2"/>
+    <w:link w:val="ab"/>
     <w:uiPriority w:val="99"/>
     <w:semiHidden/>
     <w:rPr>
@@ -13494,9 +13843,9 @@
       <w:sz w:val="16"/>
     </w:rPr>
   </w:style>
-  <w:style w:type="character" w:styleId="Strong">
+  <w:style w:type="character" w:styleId="ac">
     <w:name w:val="Strong"/>
-    <w:basedOn w:val="DefaultParagraphFont"/>
+    <w:basedOn w:val="a2"/>
     <w:uiPriority w:val="22"/>
     <w:qFormat/>
     <w:rPr>
@@ -13504,10 +13853,10 @@
       <w:bCs/>
     </w:rPr>
   </w:style>
-  <w:style w:type="character" w:customStyle="1" w:styleId="SubtitleChar">
-    <w:name w:val="Subtitle Char"/>
-    <w:basedOn w:val="DefaultParagraphFont"/>
-    <w:link w:val="Subtitle"/>
+  <w:style w:type="character" w:customStyle="1" w:styleId="Char0">
+    <w:name w:val="عنوان فرعي Char"/>
+    <w:basedOn w:val="a2"/>
+    <w:link w:val="a6"/>
     <w:uiPriority w:val="3"/>
     <w:rPr>
       <w:rFonts w:asciiTheme="majorHAnsi" w:eastAsiaTheme="majorEastAsia" w:hAnsiTheme="majorHAnsi" w:cstheme="majorBidi"/>
@@ -13521,7 +13870,7 @@
   </w:style>
   <w:style w:type="paragraph" w:customStyle="1" w:styleId="Abstract">
     <w:name w:val="Abstract"/>
-    <w:basedOn w:val="Normal"/>
+    <w:basedOn w:val="a1"/>
     <w:uiPriority w:val="3"/>
     <w:qFormat/>
     <w:pPr>
@@ -13535,9 +13884,9 @@
       <w:sz w:val="28"/>
     </w:rPr>
   </w:style>
-  <w:style w:type="paragraph" w:styleId="NoSpacing">
+  <w:style w:type="paragraph" w:styleId="ad">
     <w:name w:val="No Spacing"/>
-    <w:link w:val="NoSpacingChar"/>
+    <w:link w:val="Char4"/>
     <w:uiPriority w:val="1"/>
     <w:unhideWhenUsed/>
     <w:qFormat/>
@@ -13547,7 +13896,7 @@
   </w:style>
   <w:style w:type="character" w:styleId="Hyperlink">
     <w:name w:val="Hyperlink"/>
-    <w:basedOn w:val="DefaultParagraphFont"/>
+    <w:basedOn w:val="a2"/>
     <w:uiPriority w:val="99"/>
     <w:unhideWhenUsed/>
     <w:rPr>
@@ -13555,10 +13904,10 @@
       <w:u w:val="single"/>
     </w:rPr>
   </w:style>
-  <w:style w:type="paragraph" w:styleId="TOC1">
+  <w:style w:type="paragraph" w:styleId="10">
     <w:name w:val="toc 1"/>
-    <w:basedOn w:val="Normal"/>
-    <w:next w:val="Normal"/>
+    <w:basedOn w:val="a1"/>
+    <w:next w:val="a1"/>
     <w:autoRedefine/>
     <w:uiPriority w:val="39"/>
     <w:unhideWhenUsed/>
@@ -13573,10 +13922,10 @@
       <w:kern w:val="20"/>
     </w:rPr>
   </w:style>
-  <w:style w:type="character" w:customStyle="1" w:styleId="Heading1Char">
-    <w:name w:val="Heading 1 Char"/>
-    <w:basedOn w:val="DefaultParagraphFont"/>
-    <w:link w:val="Heading1"/>
+  <w:style w:type="character" w:customStyle="1" w:styleId="1Char">
+    <w:name w:val="العنوان 1 Char"/>
+    <w:basedOn w:val="a2"/>
+    <w:link w:val="1"/>
     <w:uiPriority w:val="1"/>
     <w:rPr>
       <w:rFonts w:asciiTheme="majorHAnsi" w:eastAsiaTheme="majorEastAsia" w:hAnsiTheme="majorHAnsi" w:cstheme="majorBidi"/>
@@ -13586,10 +13935,10 @@
       <w:sz w:val="40"/>
     </w:rPr>
   </w:style>
-  <w:style w:type="paragraph" w:styleId="TOCHeading">
+  <w:style w:type="paragraph" w:styleId="ae">
     <w:name w:val="TOC Heading"/>
-    <w:basedOn w:val="Heading1"/>
-    <w:next w:val="Normal"/>
+    <w:basedOn w:val="1"/>
+    <w:next w:val="a1"/>
     <w:uiPriority w:val="39"/>
     <w:unhideWhenUsed/>
     <w:qFormat/>
@@ -13606,10 +13955,10 @@
       <w:sz w:val="44"/>
     </w:rPr>
   </w:style>
-  <w:style w:type="character" w:customStyle="1" w:styleId="Heading2Char">
-    <w:name w:val="Heading 2 Char"/>
-    <w:basedOn w:val="DefaultParagraphFont"/>
-    <w:link w:val="Heading2"/>
+  <w:style w:type="character" w:customStyle="1" w:styleId="2Char">
+    <w:name w:val="عنوان 2 Char"/>
+    <w:basedOn w:val="a2"/>
+    <w:link w:val="20"/>
     <w:uiPriority w:val="1"/>
     <w:rPr>
       <w:rFonts w:asciiTheme="majorHAnsi" w:eastAsiaTheme="majorEastAsia" w:hAnsiTheme="majorHAnsi" w:cstheme="majorBidi"/>
@@ -13619,11 +13968,11 @@
       <w:sz w:val="28"/>
     </w:rPr>
   </w:style>
-  <w:style w:type="paragraph" w:styleId="Quote">
+  <w:style w:type="paragraph" w:styleId="af">
     <w:name w:val="Quote"/>
-    <w:basedOn w:val="Normal"/>
-    <w:next w:val="Normal"/>
-    <w:link w:val="QuoteChar"/>
+    <w:basedOn w:val="a1"/>
+    <w:next w:val="a1"/>
+    <w:link w:val="Char5"/>
     <w:uiPriority w:val="1"/>
     <w:unhideWhenUsed/>
     <w:qFormat/>
@@ -13638,10 +13987,10 @@
       <w:sz w:val="24"/>
     </w:rPr>
   </w:style>
-  <w:style w:type="character" w:customStyle="1" w:styleId="QuoteChar">
-    <w:name w:val="Quote Char"/>
-    <w:basedOn w:val="DefaultParagraphFont"/>
-    <w:link w:val="Quote"/>
+  <w:style w:type="character" w:customStyle="1" w:styleId="Char5">
+    <w:name w:val="اقتباس Char"/>
+    <w:basedOn w:val="a2"/>
+    <w:link w:val="af"/>
     <w:uiPriority w:val="1"/>
     <w:rPr>
       <w:i/>
@@ -13651,10 +14000,10 @@
       <w:sz w:val="24"/>
     </w:rPr>
   </w:style>
-  <w:style w:type="paragraph" w:styleId="Signature">
+  <w:style w:type="paragraph" w:styleId="af0">
     <w:name w:val="Signature"/>
-    <w:basedOn w:val="Normal"/>
-    <w:link w:val="SignatureChar"/>
+    <w:basedOn w:val="a1"/>
+    <w:link w:val="Char6"/>
     <w:uiPriority w:val="9"/>
     <w:unhideWhenUsed/>
     <w:qFormat/>
@@ -13667,25 +14016,25 @@
       <w:kern w:val="20"/>
     </w:rPr>
   </w:style>
-  <w:style w:type="character" w:customStyle="1" w:styleId="SignatureChar">
-    <w:name w:val="Signature Char"/>
-    <w:basedOn w:val="DefaultParagraphFont"/>
-    <w:link w:val="Signature"/>
+  <w:style w:type="character" w:customStyle="1" w:styleId="Char6">
+    <w:name w:val="توقيع Char"/>
+    <w:basedOn w:val="a2"/>
+    <w:link w:val="af0"/>
     <w:uiPriority w:val="9"/>
     <w:rPr>
       <w:color w:val="595959" w:themeColor="text1" w:themeTint="A6"/>
       <w:kern w:val="20"/>
     </w:rPr>
   </w:style>
-  <w:style w:type="character" w:customStyle="1" w:styleId="NoSpacingChar">
-    <w:name w:val="No Spacing Char"/>
-    <w:basedOn w:val="DefaultParagraphFont"/>
-    <w:link w:val="NoSpacing"/>
+  <w:style w:type="character" w:customStyle="1" w:styleId="Char4">
+    <w:name w:val="بلا تباعد Char"/>
+    <w:basedOn w:val="a2"/>
+    <w:link w:val="ad"/>
     <w:uiPriority w:val="1"/>
   </w:style>
-  <w:style w:type="paragraph" w:styleId="ListBullet">
+  <w:style w:type="paragraph" w:styleId="a">
     <w:name w:val="List Bullet"/>
-    <w:basedOn w:val="Normal"/>
+    <w:basedOn w:val="a1"/>
     <w:uiPriority w:val="1"/>
     <w:unhideWhenUsed/>
     <w:qFormat/>
@@ -13700,9 +14049,9 @@
       <w:kern w:val="20"/>
     </w:rPr>
   </w:style>
-  <w:style w:type="paragraph" w:styleId="ListNumber">
+  <w:style w:type="paragraph" w:styleId="a0">
     <w:name w:val="List Number"/>
-    <w:basedOn w:val="Normal"/>
+    <w:basedOn w:val="a1"/>
     <w:uiPriority w:val="1"/>
     <w:unhideWhenUsed/>
     <w:qFormat/>
@@ -13718,9 +14067,9 @@
       <w:kern w:val="20"/>
     </w:rPr>
   </w:style>
-  <w:style w:type="paragraph" w:styleId="ListNumber2">
+  <w:style w:type="paragraph" w:styleId="2">
     <w:name w:val="List Number 2"/>
-    <w:basedOn w:val="Normal"/>
+    <w:basedOn w:val="a1"/>
     <w:uiPriority w:val="1"/>
     <w:unhideWhenUsed/>
     <w:qFormat/>
@@ -13737,9 +14086,9 @@
       <w:kern w:val="20"/>
     </w:rPr>
   </w:style>
-  <w:style w:type="paragraph" w:styleId="ListNumber3">
+  <w:style w:type="paragraph" w:styleId="3">
     <w:name w:val="List Number 3"/>
-    <w:basedOn w:val="Normal"/>
+    <w:basedOn w:val="a1"/>
     <w:uiPriority w:val="18"/>
     <w:unhideWhenUsed/>
     <w:pPr>
@@ -13755,9 +14104,9 @@
       <w:kern w:val="20"/>
     </w:rPr>
   </w:style>
-  <w:style w:type="paragraph" w:styleId="ListNumber4">
+  <w:style w:type="paragraph" w:styleId="4">
     <w:name w:val="List Number 4"/>
-    <w:basedOn w:val="Normal"/>
+    <w:basedOn w:val="a1"/>
     <w:uiPriority w:val="18"/>
     <w:unhideWhenUsed/>
     <w:pPr>
@@ -13773,9 +14122,9 @@
       <w:kern w:val="20"/>
     </w:rPr>
   </w:style>
-  <w:style w:type="paragraph" w:styleId="ListNumber5">
+  <w:style w:type="paragraph" w:styleId="5">
     <w:name w:val="List Number 5"/>
-    <w:basedOn w:val="Normal"/>
+    <w:basedOn w:val="a1"/>
     <w:uiPriority w:val="18"/>
     <w:unhideWhenUsed/>
     <w:pPr>
@@ -13793,7 +14142,7 @@
   </w:style>
   <w:style w:type="table" w:customStyle="1" w:styleId="FinancialTable">
     <w:name w:val="Financial Table"/>
-    <w:basedOn w:val="TableNormal"/>
+    <w:basedOn w:val="a3"/>
     <w:uiPriority w:val="99"/>
     <w:pPr>
       <w:spacing w:before="60" w:after="60" w:line="240" w:lineRule="auto"/>
@@ -13835,9 +14184,9 @@
       </w:rPr>
     </w:tblStylePr>
   </w:style>
-  <w:style w:type="character" w:styleId="CommentReference">
+  <w:style w:type="character" w:styleId="af1">
     <w:name w:val="annotation reference"/>
-    <w:basedOn w:val="DefaultParagraphFont"/>
+    <w:basedOn w:val="a2"/>
     <w:uiPriority w:val="99"/>
     <w:semiHidden/>
     <w:unhideWhenUsed/>
@@ -13845,10 +14194,10 @@
       <w:sz w:val="16"/>
     </w:rPr>
   </w:style>
-  <w:style w:type="paragraph" w:styleId="CommentText">
+  <w:style w:type="paragraph" w:styleId="af2">
     <w:name w:val="annotation text"/>
-    <w:basedOn w:val="Normal"/>
-    <w:link w:val="CommentTextChar"/>
+    <w:basedOn w:val="a1"/>
+    <w:link w:val="Char7"/>
     <w:uiPriority w:val="99"/>
     <w:semiHidden/>
     <w:unhideWhenUsed/>
@@ -13856,18 +14205,18 @@
       <w:spacing w:line="240" w:lineRule="auto"/>
     </w:pPr>
   </w:style>
-  <w:style w:type="character" w:customStyle="1" w:styleId="CommentTextChar">
-    <w:name w:val="Comment Text Char"/>
-    <w:basedOn w:val="DefaultParagraphFont"/>
-    <w:link w:val="CommentText"/>
+  <w:style w:type="character" w:customStyle="1" w:styleId="Char7">
+    <w:name w:val="نص تعليق Char"/>
+    <w:basedOn w:val="a2"/>
+    <w:link w:val="af2"/>
     <w:uiPriority w:val="99"/>
     <w:semiHidden/>
   </w:style>
-  <w:style w:type="paragraph" w:styleId="CommentSubject">
+  <w:style w:type="paragraph" w:styleId="af3">
     <w:name w:val="annotation subject"/>
-    <w:basedOn w:val="CommentText"/>
-    <w:next w:val="CommentText"/>
-    <w:link w:val="CommentSubjectChar"/>
+    <w:basedOn w:val="af2"/>
+    <w:next w:val="af2"/>
+    <w:link w:val="Char8"/>
     <w:uiPriority w:val="99"/>
     <w:semiHidden/>
     <w:unhideWhenUsed/>
@@ -13876,10 +14225,10 @@
       <w:bCs/>
     </w:rPr>
   </w:style>
-  <w:style w:type="character" w:customStyle="1" w:styleId="CommentSubjectChar">
-    <w:name w:val="Comment Subject Char"/>
-    <w:basedOn w:val="CommentTextChar"/>
-    <w:link w:val="CommentSubject"/>
+  <w:style w:type="character" w:customStyle="1" w:styleId="Char8">
+    <w:name w:val="موضوع تعليق Char"/>
+    <w:basedOn w:val="Char7"/>
+    <w:link w:val="af3"/>
     <w:uiPriority w:val="99"/>
     <w:semiHidden/>
     <w:rPr>
@@ -13887,9 +14236,9 @@
       <w:bCs/>
     </w:rPr>
   </w:style>
-  <w:style w:type="table" w:styleId="LightShading">
+  <w:style w:type="table" w:styleId="af4">
     <w:name w:val="Light Shading"/>
-    <w:basedOn w:val="TableNormal"/>
+    <w:basedOn w:val="a3"/>
     <w:uiPriority w:val="60"/>
     <w:pPr>
       <w:spacing w:after="0" w:line="240" w:lineRule="auto"/>
@@ -13984,7 +14333,7 @@
   </w:style>
   <w:style w:type="paragraph" w:customStyle="1" w:styleId="TableTextDecimal">
     <w:name w:val="Table Text Decimal"/>
-    <w:basedOn w:val="Normal"/>
+    <w:basedOn w:val="a1"/>
     <w:uiPriority w:val="1"/>
     <w:qFormat/>
     <w:pPr>
@@ -13996,7 +14345,7 @@
   </w:style>
   <w:style w:type="paragraph" w:customStyle="1" w:styleId="TableText">
     <w:name w:val="Table Text"/>
-    <w:basedOn w:val="Normal"/>
+    <w:basedOn w:val="a1"/>
     <w:uiPriority w:val="1"/>
     <w:qFormat/>
     <w:pPr>
@@ -14005,7 +14354,7 @@
   </w:style>
   <w:style w:type="paragraph" w:customStyle="1" w:styleId="Organization">
     <w:name w:val="Organization"/>
-    <w:basedOn w:val="Normal"/>
+    <w:basedOn w:val="a1"/>
     <w:uiPriority w:val="2"/>
     <w:qFormat/>
     <w:pPr>
@@ -14019,9 +14368,9 @@
       <w:sz w:val="36"/>
     </w:rPr>
   </w:style>
-  <w:style w:type="paragraph" w:styleId="ListParagraph">
+  <w:style w:type="paragraph" w:styleId="af5">
     <w:name w:val="List Paragraph"/>
-    <w:basedOn w:val="Normal"/>
+    <w:basedOn w:val="a1"/>
     <w:qFormat/>
     <w:rsid w:val="001B698D"/>
     <w:pPr>
@@ -14029,9 +14378,9 @@
       <w:contextualSpacing/>
     </w:pPr>
   </w:style>
-  <w:style w:type="paragraph" w:styleId="NormalWeb">
+  <w:style w:type="paragraph" w:styleId="af6">
     <w:name w:val="Normal (Web)"/>
-    <w:basedOn w:val="Normal"/>
+    <w:basedOn w:val="a1"/>
     <w:uiPriority w:val="99"/>
     <w:unhideWhenUsed/>
     <w:rsid w:val="00FF1242"/>
@@ -14046,10 +14395,10 @@
       <w:lang w:eastAsia="en-US"/>
     </w:rPr>
   </w:style>
-  <w:style w:type="character" w:customStyle="1" w:styleId="Heading3Char">
-    <w:name w:val="Heading 3 Char"/>
-    <w:basedOn w:val="DefaultParagraphFont"/>
-    <w:link w:val="Heading3"/>
+  <w:style w:type="character" w:customStyle="1" w:styleId="3Char">
+    <w:name w:val="عنوان 3 Char"/>
+    <w:basedOn w:val="a2"/>
+    <w:link w:val="30"/>
     <w:uiPriority w:val="1"/>
     <w:semiHidden/>
     <w:rsid w:val="005A5605"/>
@@ -14060,9 +14409,9 @@
       <w:szCs w:val="24"/>
     </w:rPr>
   </w:style>
-  <w:style w:type="character" w:styleId="Emphasis">
+  <w:style w:type="character" w:styleId="af7">
     <w:name w:val="Emphasis"/>
-    <w:basedOn w:val="DefaultParagraphFont"/>
+    <w:basedOn w:val="a2"/>
     <w:uiPriority w:val="20"/>
     <w:qFormat/>
     <w:rsid w:val="00795E35"/>
@@ -14073,12 +14422,12 @@
   </w:style>
   <w:style w:type="character" w:customStyle="1" w:styleId="citationstylesgno2wrpf">
     <w:name w:val="citationstyles_gno2wrpf"/>
-    <w:basedOn w:val="DefaultParagraphFont"/>
+    <w:basedOn w:val="a2"/>
     <w:rsid w:val="00795E35"/>
   </w:style>
   <w:style w:type="character" w:customStyle="1" w:styleId="UnresolvedMention1">
     <w:name w:val="Unresolved Mention1"/>
-    <w:basedOn w:val="DefaultParagraphFont"/>
+    <w:basedOn w:val="a2"/>
     <w:uiPriority w:val="99"/>
     <w:semiHidden/>
     <w:unhideWhenUsed/>
@@ -14090,7 +14439,7 @@
   </w:style>
   <w:style w:type="character" w:customStyle="1" w:styleId="keyword">
     <w:name w:val="keyword"/>
-    <w:basedOn w:val="DefaultParagraphFont"/>
+    <w:basedOn w:val="a2"/>
     <w:rsid w:val="00C21A26"/>
   </w:style>
   <w:style w:type="paragraph" w:customStyle="1" w:styleId="Default">
@@ -14109,9 +14458,9 @@
       <w:szCs w:val="24"/>
     </w:rPr>
   </w:style>
-  <w:style w:type="table" w:styleId="TableGridLight">
+  <w:style w:type="table" w:styleId="af8">
     <w:name w:val="Grid Table Light"/>
-    <w:basedOn w:val="TableNormal"/>
+    <w:basedOn w:val="a3"/>
     <w:uiPriority w:val="45"/>
     <w:rsid w:val="0008684B"/>
     <w:pPr>
@@ -14127,6 +14476,33 @@
         <w:insideV w:val="single" w:sz="4" w:space="0" w:color="BFBFBF" w:themeColor="background1" w:themeShade="BF"/>
       </w:tblBorders>
     </w:tblPr>
+  </w:style>
+  <w:style w:type="paragraph" w:customStyle="1" w:styleId="pdq2pgselectionanchorcontainer">
+    <w:name w:val="pdq2pg_selectionanchorcontainer"/>
+    <w:basedOn w:val="a1"/>
+    <w:rsid w:val="0072035E"/>
+    <w:pPr>
+      <w:spacing w:before="100" w:beforeAutospacing="1" w:after="100" w:afterAutospacing="1" w:line="240" w:lineRule="auto"/>
+    </w:pPr>
+    <w:rPr>
+      <w:rFonts w:ascii="Times New Roman" w:eastAsia="Times New Roman" w:hAnsi="Times New Roman" w:cs="Times New Roman"/>
+      <w:color w:val="auto"/>
+      <w:sz w:val="24"/>
+      <w:szCs w:val="24"/>
+      <w:lang w:eastAsia="en-US"/>
+    </w:rPr>
+  </w:style>
+  <w:style w:type="character" w:styleId="af9">
+    <w:name w:val="Unresolved Mention"/>
+    <w:basedOn w:val="a2"/>
+    <w:uiPriority w:val="99"/>
+    <w:semiHidden/>
+    <w:unhideWhenUsed/>
+    <w:rsid w:val="009A3FF9"/>
+    <w:rPr>
+      <w:color w:val="605E5C"/>
+      <w:shd w:val="clear" w:color="auto" w:fill="E1DFDD"/>
+    </w:rPr>
   </w:style>
 </w:styles>
 </file>
@@ -14318,7 +14694,7 @@
     <w:lvl w:ilvl="0">
       <w:start w:val="1"/>
       <w:numFmt w:val="bullet"/>
-      <w:pStyle w:val="ListBullet"/>
+      <w:pStyle w:val="a"/>
       <w:lvlText w:val="•"/>
       <w:lvlJc w:val="left"/>
       <w:pPr>
@@ -14381,6 +14757,7 @@
     <w:rsid w:val="0096178B"/>
     <w:rsid w:val="00977680"/>
     <w:rsid w:val="00A53609"/>
+    <w:rsid w:val="00A64C9F"/>
     <w:rsid w:val="00A84AB3"/>
     <w:rsid w:val="00AB302F"/>
     <w:rsid w:val="00AC3A9C"/>
@@ -14400,6 +14777,7 @@
     <w:rsid w:val="00EA7B1C"/>
     <w:rsid w:val="00F33075"/>
     <w:rsid w:val="00F4300D"/>
+    <w:rsid w:val="00F76E11"/>
     <w:rsid w:val="00FB7D56"/>
     <w:rsid w:val="00FC793C"/>
     <w:rsid w:val="00FF0C7C"/>
@@ -14420,7 +14798,7 @@
   <w:themeFontLang w:val="en-GB" w:eastAsia="ja-JP" w:bidi="ar-SA"/>
   <w:clrSchemeMapping w:bg1="light1" w:t1="dark1" w:bg2="light2" w:t2="dark2" w:accent1="accent1" w:accent2="accent2" w:accent3="accent3" w:accent4="accent4" w:accent5="accent5" w:accent6="accent6" w:hyperlink="hyperlink" w:followedHyperlink="followedHyperlink"/>
   <w:decimalSymbol w:val="."/>
-  <w:listSeparator w:val=","/>
+  <w:listSeparator w:val=";"/>
   <w15:chartTrackingRefBased/>
 </w:settings>
 </file>
@@ -14820,17 +15198,17 @@
     <w:lsdException w:name="Unresolved Mention" w:semiHidden="1" w:unhideWhenUsed="1"/>
     <w:lsdException w:name="Smart Link" w:semiHidden="1" w:unhideWhenUsed="1"/>
   </w:latentStyles>
-  <w:style w:type="paragraph" w:default="1" w:styleId="Normal">
+  <w:style w:type="paragraph" w:default="1" w:styleId="a0">
     <w:name w:val="Normal"/>
     <w:qFormat/>
   </w:style>
-  <w:style w:type="character" w:default="1" w:styleId="DefaultParagraphFont">
+  <w:style w:type="character" w:default="1" w:styleId="a1">
     <w:name w:val="Default Paragraph Font"/>
     <w:uiPriority w:val="1"/>
     <w:semiHidden/>
     <w:unhideWhenUsed/>
   </w:style>
-  <w:style w:type="table" w:default="1" w:styleId="TableNormal">
+  <w:style w:type="table" w:default="1" w:styleId="a2">
     <w:name w:val="Normal Table"/>
     <w:uiPriority w:val="99"/>
     <w:semiHidden/>
@@ -14845,15 +15223,15 @@
       </w:tblCellMar>
     </w:tblPr>
   </w:style>
-  <w:style w:type="numbering" w:default="1" w:styleId="NoList">
+  <w:style w:type="numbering" w:default="1" w:styleId="a3">
     <w:name w:val="No List"/>
     <w:uiPriority w:val="99"/>
     <w:semiHidden/>
     <w:unhideWhenUsed/>
   </w:style>
-  <w:style w:type="paragraph" w:styleId="ListBullet">
+  <w:style w:type="paragraph" w:styleId="a">
     <w:name w:val="List Bullet"/>
-    <w:basedOn w:val="Normal"/>
+    <w:basedOn w:val="a0"/>
     <w:uiPriority w:val="1"/>
     <w:unhideWhenUsed/>
     <w:qFormat/>
@@ -14870,9 +15248,9 @@
       <w:lang w:val="en-US" w:eastAsia="en-US"/>
     </w:rPr>
   </w:style>
-  <w:style w:type="character" w:styleId="Strong">
+  <w:style w:type="character" w:styleId="a4">
     <w:name w:val="Strong"/>
-    <w:basedOn w:val="DefaultParagraphFont"/>
+    <w:basedOn w:val="a1"/>
     <w:uiPriority w:val="10"/>
     <w:qFormat/>
     <w:rPr>

</xml_diff>